<commit_message>
Add the how-to-measure steps to the HACCP plan.
Section 9 tells the operator how to use the probe, the oven thermometer, and the water-activity meter, in English and in Spanish, and points each reading at the log.

Co-authored-by: quique2220-coder <quique2220-coder@users.noreply.github.com>
</commit_message>
<xml_diff>
--- a/haccp-plan/final/HACCP-Plan-Beef-Jerky-Final.docx
+++ b/haccp-plan/final/HACCP-Plan-Beef-Jerky-Final.docx
@@ -3508,7 +3508,7 @@
           <w:color w:val="1E1A16"/>
           <w:sz w:val="22"/>
         </w:rPr>
-        <w:t>• Thermometers and the water-activity meter are calibrated on the schedule in Section 8. An instrument that fails calibration is removed, and the lots checked with it since the last good calibration are reviewed.</w:t>
+        <w:t>• Thermometers and the water-activity meter are checked by the method in Section 9.5. An instrument that fails calibration is removed, and the lots checked with it since the last good calibration are reviewed.</w:t>
       </w:r>
     </w:p>
     <w:p>
@@ -3739,7 +3739,22 @@
           <w:color w:val="1F4D36"/>
           <w:sz w:val="32"/>
         </w:rPr>
-        <w:t>9. Forms</w:t>
+        <w:t>9. How to measure each limit</w:t>
+      </w:r>
+    </w:p>
+    <w:p>
+      <w:pPr>
+        <w:spacing w:before="0" w:after="120" w:line="240" w:lineRule="auto"/>
+      </w:pPr>
+      <w:r>
+        <w:rPr>
+          <w:rFonts w:ascii="Calibri" w:hAnsi="Calibri" w:eastAsia="Calibri"/>
+          <w:b w:val="0"/>
+          <w:i w:val="0"/>
+          <w:color w:val="1E1A16"/>
+          <w:sz w:val="22"/>
+        </w:rPr>
+        <w:t>Three instruments are used. A leave-in probe thermometer stays in the meat. A second thermometer hangs in the oven air during drying. A water-activity meter reads the finished jerky. The oven dial is the setting. The number written on the log is the number on the instrument.</w:t>
       </w:r>
     </w:p>
     <w:p>
@@ -3754,7 +3769,650 @@
           <w:color w:val="1F4D36"/>
           <w:sz w:val="26"/>
         </w:rPr>
-        <w:t>9.1 CCP 1 log — lethality</w:t>
+        <w:t>9.1 Cold meat, before cooking</w:t>
+      </w:r>
+    </w:p>
+    <w:p>
+      <w:pPr>
+        <w:spacing w:before="0" w:after="120" w:line="240" w:lineRule="auto"/>
+      </w:pPr>
+      <w:r>
+        <w:rPr>
+          <w:rFonts w:ascii="Calibri" w:hAnsi="Calibri" w:eastAsia="Calibri"/>
+          <w:b w:val="0"/>
+          <w:i w:val="0"/>
+          <w:color w:val="1E1A16"/>
+          <w:sz w:val="22"/>
+        </w:rPr>
+        <w:t>Put the probe in the meat, not in the air of the cooler. Write the time and the temperature on Form 10.3. The limit is 41°F or below.</w:t>
+      </w:r>
+    </w:p>
+    <w:p>
+      <w:pPr>
+        <w:spacing w:before="200" w:after="80" w:line="240" w:lineRule="auto"/>
+      </w:pPr>
+      <w:r>
+        <w:rPr>
+          <w:rFonts w:ascii="Calibri" w:hAnsi="Calibri" w:eastAsia="Calibri"/>
+          <w:b/>
+          <w:i w:val="0"/>
+          <w:color w:val="1F4D36"/>
+          <w:sz w:val="26"/>
+        </w:rPr>
+        <w:t>9.2 Lethality — the probe stays inside the sealed bag</w:t>
+      </w:r>
+    </w:p>
+    <w:p>
+      <w:pPr>
+        <w:spacing w:before="0" w:after="120" w:line="240" w:lineRule="auto"/>
+      </w:pPr>
+      <w:r>
+        <w:rPr>
+          <w:rFonts w:ascii="Calibri" w:hAnsi="Calibri" w:eastAsia="Calibri"/>
+          <w:b w:val="0"/>
+          <w:i w:val="0"/>
+          <w:color w:val="1E1A16"/>
+          <w:sz w:val="22"/>
+        </w:rPr>
+        <w:t>Choose the thickest strip and place it in the part of the oven that heats last. Put the tip of the probe in the center of that strip. The tip does not stick out into the air and does not touch the rack. Seal the bag around the probe cable so moisture stays in the bag. The bag is not opened to read the temperature.</w:t>
+      </w:r>
+    </w:p>
+    <w:p>
+      <w:pPr>
+        <w:spacing w:before="0" w:after="120" w:line="240" w:lineRule="auto"/>
+      </w:pPr>
+      <w:r>
+        <w:rPr>
+          <w:rFonts w:ascii="Calibri" w:hAnsi="Calibri" w:eastAsia="Calibri"/>
+          <w:b w:val="0"/>
+          <w:i w:val="0"/>
+          <w:color w:val="1E1A16"/>
+          <w:sz w:val="22"/>
+        </w:rPr>
+        <w:t>On Form 10.1, with that same probe, write the clock at three points.</w:t>
+      </w:r>
+    </w:p>
+    <w:tbl>
+      <w:tblPr>
+        <w:tblStyle w:val="TableGrid"/>
+        <w:tblW w:type="auto" w:w="0"/>
+        <w:tblLook w:firstColumn="1" w:firstRow="1" w:lastColumn="0" w:lastRow="0" w:noHBand="0" w:noVBand="1" w:val="04A0"/>
+      </w:tblPr>
+      <w:tblGrid>
+        <w:gridCol w:w="5213"/>
+        <w:gridCol w:w="5213"/>
+      </w:tblGrid>
+      <w:tr>
+        <w:trPr>
+          <w:cantSplit/>
+        </w:trPr>
+        <w:tc>
+          <w:tcPr>
+            <w:tcW w:type="dxa" w:w="5213"/>
+            <w:shd w:fill="1F4D36" w:val="clear"/>
+          </w:tcPr>
+          <w:p>
+            <w:r/>
+            <w:r>
+              <w:rPr>
+                <w:rFonts w:ascii="Calibri" w:hAnsi="Calibri" w:eastAsia="Calibri"/>
+                <w:b/>
+                <w:i w:val="0"/>
+                <w:color w:val="FFFFFF"/>
+                <w:sz w:val="20"/>
+              </w:rPr>
+              <w:t>When the meat reads</w:t>
+            </w:r>
+          </w:p>
+        </w:tc>
+        <w:tc>
+          <w:tcPr>
+            <w:tcW w:type="dxa" w:w="5213"/>
+            <w:shd w:fill="1F4D36" w:val="clear"/>
+          </w:tcPr>
+          <w:p>
+            <w:r/>
+            <w:r>
+              <w:rPr>
+                <w:rFonts w:ascii="Calibri" w:hAnsi="Calibri" w:eastAsia="Calibri"/>
+                <w:b/>
+                <w:i w:val="0"/>
+                <w:color w:val="FFFFFF"/>
+                <w:sz w:val="20"/>
+              </w:rPr>
+              <w:t>What is written</w:t>
+            </w:r>
+          </w:p>
+        </w:tc>
+      </w:tr>
+      <w:tr>
+        <w:trPr>
+          <w:cantSplit/>
+        </w:trPr>
+        <w:tc>
+          <w:tcPr>
+            <w:tcW w:type="dxa" w:w="5213"/>
+          </w:tcPr>
+          <w:p>
+            <w:r/>
+            <w:r>
+              <w:rPr>
+                <w:rFonts w:ascii="Calibri" w:hAnsi="Calibri" w:eastAsia="Calibri"/>
+                <w:b w:val="0"/>
+                <w:i w:val="0"/>
+                <w:color w:val="1E1A16"/>
+                <w:sz w:val="20"/>
+              </w:rPr>
+              <w:t>50°F</w:t>
+            </w:r>
+          </w:p>
+        </w:tc>
+        <w:tc>
+          <w:tcPr>
+            <w:tcW w:type="dxa" w:w="5213"/>
+          </w:tcPr>
+          <w:p>
+            <w:r/>
+            <w:r>
+              <w:rPr>
+                <w:rFonts w:ascii="Calibri" w:hAnsi="Calibri" w:eastAsia="Calibri"/>
+                <w:b w:val="0"/>
+                <w:i w:val="0"/>
+                <w:color w:val="1E1A16"/>
+                <w:sz w:val="20"/>
+              </w:rPr>
+              <w:t>The clock time.</w:t>
+            </w:r>
+          </w:p>
+        </w:tc>
+      </w:tr>
+      <w:tr>
+        <w:trPr>
+          <w:cantSplit/>
+        </w:trPr>
+        <w:tc>
+          <w:tcPr>
+            <w:tcW w:type="dxa" w:w="5213"/>
+            <w:shd w:fill="F4F1EA" w:val="clear"/>
+          </w:tcPr>
+          <w:p>
+            <w:r/>
+            <w:r>
+              <w:rPr>
+                <w:rFonts w:ascii="Calibri" w:hAnsi="Calibri" w:eastAsia="Calibri"/>
+                <w:b w:val="0"/>
+                <w:i w:val="0"/>
+                <w:color w:val="1E1A16"/>
+                <w:sz w:val="20"/>
+              </w:rPr>
+              <w:t>130°F</w:t>
+            </w:r>
+          </w:p>
+        </w:tc>
+        <w:tc>
+          <w:tcPr>
+            <w:tcW w:type="dxa" w:w="5213"/>
+            <w:shd w:fill="F4F1EA" w:val="clear"/>
+          </w:tcPr>
+          <w:p>
+            <w:r/>
+            <w:r>
+              <w:rPr>
+                <w:rFonts w:ascii="Calibri" w:hAnsi="Calibri" w:eastAsia="Calibri"/>
+                <w:b w:val="0"/>
+                <w:i w:val="0"/>
+                <w:color w:val="1E1A16"/>
+                <w:sz w:val="20"/>
+              </w:rPr>
+              <w:t>The clock time.</w:t>
+            </w:r>
+          </w:p>
+        </w:tc>
+      </w:tr>
+      <w:tr>
+        <w:trPr>
+          <w:cantSplit/>
+        </w:trPr>
+        <w:tc>
+          <w:tcPr>
+            <w:tcW w:type="dxa" w:w="5213"/>
+          </w:tcPr>
+          <w:p>
+            <w:r/>
+            <w:r>
+              <w:rPr>
+                <w:rFonts w:ascii="Calibri" w:hAnsi="Calibri" w:eastAsia="Calibri"/>
+                <w:b w:val="0"/>
+                <w:i w:val="0"/>
+                <w:color w:val="1E1A16"/>
+                <w:sz w:val="20"/>
+              </w:rPr>
+              <w:t>160°F or above</w:t>
+            </w:r>
+          </w:p>
+        </w:tc>
+        <w:tc>
+          <w:tcPr>
+            <w:tcW w:type="dxa" w:w="5213"/>
+          </w:tcPr>
+          <w:p>
+            <w:r/>
+            <w:r>
+              <w:rPr>
+                <w:rFonts w:ascii="Calibri" w:hAnsi="Calibri" w:eastAsia="Calibri"/>
+                <w:b w:val="0"/>
+                <w:i w:val="0"/>
+                <w:color w:val="1E1A16"/>
+                <w:sz w:val="20"/>
+              </w:rPr>
+              <w:t>The clock time and the exact temperature.</w:t>
+            </w:r>
+          </w:p>
+        </w:tc>
+      </w:tr>
+    </w:tbl>
+    <w:p>
+      <w:pPr>
+        <w:spacing w:after="80"/>
+      </w:pPr>
+    </w:p>
+    <w:p>
+      <w:pPr>
+        <w:spacing w:before="0" w:after="120" w:line="240" w:lineRule="auto"/>
+      </w:pPr>
+      <w:r>
+        <w:rPr>
+          <w:rFonts w:ascii="Calibri" w:hAnsi="Calibri" w:eastAsia="Calibri"/>
+          <w:b w:val="0"/>
+          <w:i w:val="0"/>
+          <w:color w:val="1E1A16"/>
+          <w:sz w:val="22"/>
+        </w:rPr>
+        <w:t>Come-up time is the 130°F clock time minus the 50°F clock time. Example: 50°F at 8:00 and 130°F at 10:30 is 2 hours 30 minutes. The limit is 6 hours or less. If the bag is still sealed when the meat reaches 160°F, the cook has passed. Write the time the bag is opened. If the bag is opened before that reading, the lot is held.</w:t>
+      </w:r>
+    </w:p>
+    <w:p>
+      <w:pPr>
+        <w:spacing w:before="200" w:after="80" w:line="240" w:lineRule="auto"/>
+      </w:pPr>
+      <w:r>
+        <w:rPr>
+          <w:rFonts w:ascii="Calibri" w:hAnsi="Calibri" w:eastAsia="Calibri"/>
+          <w:b/>
+          <w:i w:val="0"/>
+          <w:color w:val="1F4D36"/>
+          <w:sz w:val="26"/>
+        </w:rPr>
+        <w:t>9.3 Drying — oven air, after the bag is opened</w:t>
+      </w:r>
+    </w:p>
+    <w:p>
+      <w:pPr>
+        <w:spacing w:before="0" w:after="120" w:line="240" w:lineRule="auto"/>
+      </w:pPr>
+      <w:r>
+        <w:rPr>
+          <w:rFonts w:ascii="Calibri" w:hAnsi="Calibri" w:eastAsia="Calibri"/>
+          <w:b w:val="0"/>
+          <w:i w:val="0"/>
+          <w:color w:val="1E1A16"/>
+          <w:sz w:val="22"/>
+        </w:rPr>
+        <w:t>Hang a thermometer in the oven air, away from the wall, not stuck in the meat. Before the strips are taken out, read that thermometer. The limit is 170°F or above. Write the degrees and the time on Form 10.2.</w:t>
+      </w:r>
+    </w:p>
+    <w:p>
+      <w:pPr>
+        <w:spacing w:before="200" w:after="80" w:line="240" w:lineRule="auto"/>
+      </w:pPr>
+      <w:r>
+        <w:rPr>
+          <w:rFonts w:ascii="Calibri" w:hAnsi="Calibri" w:eastAsia="Calibri"/>
+          <w:b/>
+          <w:i w:val="0"/>
+          <w:color w:val="1F4D36"/>
+          <w:sz w:val="26"/>
+        </w:rPr>
+        <w:t>9.4 Water activity — before packing</w:t>
+      </w:r>
+    </w:p>
+    <w:p>
+      <w:pPr>
+        <w:spacing w:before="0" w:after="120" w:line="240" w:lineRule="auto"/>
+      </w:pPr>
+      <w:r>
+        <w:rPr>
+          <w:rFonts w:ascii="Calibri" w:hAnsi="Calibri" w:eastAsia="Calibri"/>
+          <w:b w:val="0"/>
+          <w:i w:val="0"/>
+          <w:color w:val="1E1A16"/>
+          <w:sz w:val="22"/>
+        </w:rPr>
+        <w:t>The meter reads a number between 0 and 1, such as 0.81. A meter that reports only percent moisture is not this instrument.</w:t>
+      </w:r>
+    </w:p>
+    <w:p>
+      <w:pPr>
+        <w:spacing w:before="0" w:after="120" w:line="240" w:lineRule="auto"/>
+      </w:pPr>
+      <w:r>
+        <w:rPr>
+          <w:rFonts w:ascii="Calibri" w:hAnsi="Calibri" w:eastAsia="Calibri"/>
+          <w:b w:val="0"/>
+          <w:i w:val="0"/>
+          <w:color w:val="1E1A16"/>
+          <w:sz w:val="22"/>
+        </w:rPr>
+        <w:t>Let the pieces cool, covered, to the temperature in the meter’s manual. Most meters read correctly near 77°F. A strip just out of a 170°F oven gives a false reading.</w:t>
+      </w:r>
+    </w:p>
+    <w:p>
+      <w:pPr>
+        <w:spacing w:before="0" w:after="120" w:line="240" w:lineRule="auto"/>
+      </w:pPr>
+      <w:r>
+        <w:rPr>
+          <w:rFonts w:ascii="Calibri" w:hAnsi="Calibri" w:eastAsia="Calibri"/>
+          <w:b w:val="0"/>
+          <w:i w:val="0"/>
+          <w:color w:val="1E1A16"/>
+          <w:sz w:val="22"/>
+        </w:rPr>
+        <w:t>Take six strips from different places: front, middle, back, top rack, bottom rack, and one thick piece. Place each piece in the sample cup the way the manual describes. Write all six readings on Form 10.2. The lot result is the highest reading. If that reading is 0.85 or less, the lot passes. If any one reading is above 0.85, the lot is not packed.</w:t>
+      </w:r>
+    </w:p>
+    <w:p>
+      <w:pPr>
+        <w:spacing w:before="200" w:after="80" w:line="240" w:lineRule="auto"/>
+      </w:pPr>
+      <w:r>
+        <w:rPr>
+          <w:rFonts w:ascii="Calibri" w:hAnsi="Calibri" w:eastAsia="Calibri"/>
+          <w:b/>
+          <w:i w:val="0"/>
+          <w:color w:val="1F4D36"/>
+          <w:sz w:val="26"/>
+        </w:rPr>
+        <w:t>9.5 Checking the instruments</w:t>
+      </w:r>
+    </w:p>
+    <w:p>
+      <w:pPr>
+        <w:spacing w:before="0" w:after="120" w:line="240" w:lineRule="auto"/>
+      </w:pPr>
+      <w:r>
+        <w:rPr>
+          <w:rFonts w:ascii="Calibri" w:hAnsi="Calibri" w:eastAsia="Calibri"/>
+          <w:b w:val="0"/>
+          <w:i w:val="0"/>
+          <w:color w:val="1E1A16"/>
+          <w:sz w:val="22"/>
+        </w:rPr>
+        <w:t>Once each week that jerky is made:</w:t>
+      </w:r>
+    </w:p>
+    <w:p>
+      <w:pPr>
+        <w:spacing w:after="40" w:before="0"/>
+        <w:ind w:left="360"/>
+      </w:pPr>
+      <w:r>
+        <w:rPr>
+          <w:rFonts w:ascii="Calibri" w:hAnsi="Calibri" w:eastAsia="Calibri"/>
+          <w:b w:val="0"/>
+          <w:i w:val="0"/>
+          <w:color w:val="1E1A16"/>
+          <w:sz w:val="22"/>
+        </w:rPr>
+        <w:t>• Probe. A glass of ice with a little water. The probe stays in the ice water and does not touch the glass. It must read 32°F. If it does not, adjust it by the manufacturer’s instructions or remove it from use.</w:t>
+      </w:r>
+    </w:p>
+    <w:p>
+      <w:pPr>
+        <w:spacing w:after="40" w:before="0"/>
+        <w:ind w:left="360"/>
+      </w:pPr>
+      <w:r>
+        <w:rPr>
+          <w:rFonts w:ascii="Calibri" w:hAnsi="Calibri" w:eastAsia="Calibri"/>
+          <w:b w:val="0"/>
+          <w:i w:val="0"/>
+          <w:color w:val="1E1A16"/>
+          <w:sz w:val="22"/>
+        </w:rPr>
+        <w:t>• Water-activity meter. Use the salt standards supplied with the meter.</w:t>
+      </w:r>
+    </w:p>
+    <w:p>
+      <w:pPr>
+        <w:spacing w:before="0" w:after="120" w:line="240" w:lineRule="auto"/>
+      </w:pPr>
+      <w:r>
+        <w:rPr>
+          <w:rFonts w:ascii="Calibri" w:hAnsi="Calibri" w:eastAsia="Calibri"/>
+          <w:b w:val="0"/>
+          <w:i w:val="0"/>
+          <w:color w:val="1E1A16"/>
+          <w:sz w:val="22"/>
+        </w:rPr>
+        <w:t>An instrument that fails the check is not used. Lots measured with it since the last good check are reviewed.</w:t>
+      </w:r>
+    </w:p>
+    <w:p>
+      <w:pPr>
+        <w:spacing w:before="200" w:after="80" w:line="240" w:lineRule="auto"/>
+      </w:pPr>
+      <w:r>
+        <w:rPr>
+          <w:rFonts w:ascii="Calibri" w:hAnsi="Calibri" w:eastAsia="Calibri"/>
+          <w:b/>
+          <w:i w:val="0"/>
+          <w:color w:val="1F4D36"/>
+          <w:sz w:val="26"/>
+        </w:rPr>
+        <w:t>9.6 Measurements that are not taken on every lot</w:t>
+      </w:r>
+    </w:p>
+    <w:p>
+      <w:pPr>
+        <w:spacing w:before="0" w:after="120" w:line="240" w:lineRule="auto"/>
+      </w:pPr>
+      <w:r>
+        <w:rPr>
+          <w:rFonts w:ascii="Calibri" w:hAnsi="Calibri" w:eastAsia="Calibri"/>
+          <w:b w:val="0"/>
+          <w:i w:val="0"/>
+          <w:color w:val="1E1A16"/>
+          <w:sz w:val="22"/>
+        </w:rPr>
+        <w:t>A Listeria swab is taken from tables, trays, and any surface that touches the jerky after the bag is opened. The swab goes to a laboratory. It is not a test of the bag of jerky. Moisture and protein, for the name “jerky,” are sent once on the validation lots. Neither result releases the lot. The lot is released by the probe, the clock, the dry-bulb thermometer, and the water-activity meter.</w:t>
+      </w:r>
+    </w:p>
+    <w:p>
+      <w:pPr>
+        <w:spacing w:before="280" w:after="120" w:line="240" w:lineRule="auto"/>
+      </w:pPr>
+      <w:r>
+        <w:rPr>
+          <w:rFonts w:ascii="Calibri" w:hAnsi="Calibri" w:eastAsia="Calibri"/>
+          <w:b/>
+          <w:i w:val="0"/>
+          <w:color w:val="1F4D36"/>
+          <w:sz w:val="32"/>
+        </w:rPr>
+        <w:t>9-A. Cómo medir cada límite</w:t>
+      </w:r>
+    </w:p>
+    <w:p>
+      <w:pPr>
+        <w:spacing w:before="0" w:after="120" w:line="240" w:lineRule="auto"/>
+      </w:pPr>
+      <w:r>
+        <w:rPr>
+          <w:rFonts w:ascii="Calibri" w:hAnsi="Calibri" w:eastAsia="Calibri"/>
+          <w:b w:val="0"/>
+          <w:i w:val="0"/>
+          <w:color w:val="1E1A16"/>
+          <w:sz w:val="22"/>
+        </w:rPr>
+        <w:t>Esta sección es la misma instrucción, para la persona que opera el horno. Los límites siguen siendo los de la sección 6.</w:t>
+      </w:r>
+    </w:p>
+    <w:p>
+      <w:pPr>
+        <w:spacing w:before="0" w:after="120" w:line="240" w:lineRule="auto"/>
+      </w:pPr>
+      <w:r>
+        <w:rPr>
+          <w:rFonts w:ascii="Calibri" w:hAnsi="Calibri" w:eastAsia="Calibri"/>
+          <w:b w:val="0"/>
+          <w:i w:val="0"/>
+          <w:color w:val="1E1A16"/>
+          <w:sz w:val="22"/>
+        </w:rPr>
+        <w:t>Se usan tres instrumentos. Una sonda se queda dentro de la carne. Otro termómetro cuelga en el aire del horno durante el secado. Un medidor de actividad de agua lee el producto terminado. La perilla del horno es el ajuste. El número que se anota es el del instrumento.</w:t>
+      </w:r>
+    </w:p>
+    <w:p>
+      <w:pPr>
+        <w:spacing w:after="40" w:before="0"/>
+        <w:ind w:left="360"/>
+      </w:pPr>
+      <w:r>
+        <w:rPr>
+          <w:rFonts w:ascii="Calibri" w:hAnsi="Calibri" w:eastAsia="Calibri"/>
+          <w:b w:val="0"/>
+          <w:i w:val="0"/>
+          <w:color w:val="1E1A16"/>
+          <w:sz w:val="22"/>
+        </w:rPr>
+        <w:t>• Frío. La sonda va en la carne, no en el aire del refrigerador. Límite: 41°F o menos. Hoja 10.3.</w:t>
+      </w:r>
+    </w:p>
+    <w:p>
+      <w:pPr>
+        <w:spacing w:after="40" w:before="0"/>
+        <w:ind w:left="360"/>
+      </w:pPr>
+      <w:r>
+        <w:rPr>
+          <w:rFonts w:ascii="Calibri" w:hAnsi="Calibri" w:eastAsia="Calibri"/>
+          <w:b w:val="0"/>
+          <w:i w:val="0"/>
+          <w:color w:val="1E1A16"/>
+          <w:sz w:val="22"/>
+        </w:rPr>
+        <w:t>• Cocido. La tira más gruesa va en la parte del horno que se calienta menos. La punta de la sonda queda en el centro de esa tira, sin salir al aire y sin tocar la rejilla. La bolsa se cierra alrededor del cable. No se abre para ver la temperatura.</w:t>
+      </w:r>
+    </w:p>
+    <w:p>
+      <w:pPr>
+        <w:spacing w:after="40" w:before="0"/>
+        <w:ind w:left="360"/>
+      </w:pPr>
+      <w:r>
+        <w:rPr>
+          <w:rFonts w:ascii="Calibri" w:hAnsi="Calibri" w:eastAsia="Calibri"/>
+          <w:b w:val="0"/>
+          <w:i w:val="0"/>
+          <w:color w:val="1E1A16"/>
+          <w:sz w:val="22"/>
+        </w:rPr>
+        <w:t>• En la hoja 10.1 se anota la hora a 50°F, la hora a 130°F, y la hora y los grados al llegar a 160°F o más. El tiempo de subida es la hora de 130°F menos la hora de 50°F. Ejemplo: 8:00 y 10:30 son 2 horas 30 minutos. Límite: 6 horas o menos. Si a 160°F la bolsa sigue cerrada, el cocido pasó. Se anota la hora en que se abre. Si se abre antes, el lote se detiene.</w:t>
+      </w:r>
+    </w:p>
+    <w:p>
+      <w:pPr>
+        <w:spacing w:after="40" w:before="0"/>
+        <w:ind w:left="360"/>
+      </w:pPr>
+      <w:r>
+        <w:rPr>
+          <w:rFonts w:ascii="Calibri" w:hAnsi="Calibri" w:eastAsia="Calibri"/>
+          <w:b w:val="0"/>
+          <w:i w:val="0"/>
+          <w:color w:val="1E1A16"/>
+          <w:sz w:val="22"/>
+        </w:rPr>
+        <w:t>• Secado. Un termómetro cuelga en el aire del horno, lejos de la pared, sin clavarlo en la carne. Se lee antes de sacar las tiras. Límite: 170°F o más. Hoja 10.2.</w:t>
+      </w:r>
+    </w:p>
+    <w:p>
+      <w:pPr>
+        <w:spacing w:after="40" w:before="0"/>
+        <w:ind w:left="360"/>
+      </w:pPr>
+      <w:r>
+        <w:rPr>
+          <w:rFonts w:ascii="Calibri" w:hAnsi="Calibri" w:eastAsia="Calibri"/>
+          <w:b w:val="0"/>
+          <w:i w:val="0"/>
+          <w:color w:val="1E1A16"/>
+          <w:sz w:val="22"/>
+        </w:rPr>
+        <w:t>• Actividad de agua. El aparato marca un número entre 0 y 1, por ejemplo 0.81. No sirve un medidor que solo dé el porcentaje de humedad. Las piezas se enfrían tapadas hasta la temperatura del manual, casi siempre cerca de 77°F. Una tira a 170°F da una lectura falsa. Se toman seis tiras: adelante, en medio, atrás, rejilla de arriba, rejilla de abajo, y una gruesa. El resultado del lote es la lectura más alta. Si es 0.85 o menos, pasa. Si una marca más de 0.85, no se empaca.</w:t>
+      </w:r>
+    </w:p>
+    <w:p>
+      <w:pPr>
+        <w:spacing w:after="40" w:before="0"/>
+        <w:ind w:left="360"/>
+      </w:pPr>
+      <w:r>
+        <w:rPr>
+          <w:rFonts w:ascii="Calibri" w:hAnsi="Calibri" w:eastAsia="Calibri"/>
+          <w:b w:val="0"/>
+          <w:i w:val="0"/>
+          <w:color w:val="1E1A16"/>
+          <w:sz w:val="22"/>
+        </w:rPr>
+        <w:t>• Cada semana de producción: la sonda en hielo con un poco de agua, sin tocar el vaso, tiene que marcar 32°F. El medidor de actividad de agua se comprueba con las sales del fabricante. Si un aparato falla, no se usa, y se revisan los lotes medidos desde la última prueba buena.</w:t>
+      </w:r>
+    </w:p>
+    <w:p>
+      <w:pPr>
+        <w:spacing w:after="40" w:before="0"/>
+        <w:ind w:left="360"/>
+      </w:pPr>
+      <w:r>
+        <w:rPr>
+          <w:rFonts w:ascii="Calibri" w:hAnsi="Calibri" w:eastAsia="Calibri"/>
+          <w:b w:val="0"/>
+          <w:i w:val="0"/>
+          <w:color w:val="1E1A16"/>
+          <w:sz w:val="22"/>
+        </w:rPr>
+        <w:t>• El hisopo de Listeria es de mesas, charolas y superficies que tocan la carne después de abrir la bolsa. Va al laboratorio. No es un análisis de la bolsa. Humedad y proteína, para el nombre “jerky”, se mandan una vez en los lotes de validación. El lote lo sueltan la sonda, el reloj, el termómetro del aire y el medidor de actividad de agua.</w:t>
+      </w:r>
+    </w:p>
+    <w:p>
+      <w:pPr>
+        <w:spacing w:before="280" w:after="120" w:line="240" w:lineRule="auto"/>
+      </w:pPr>
+      <w:r>
+        <w:rPr>
+          <w:rFonts w:ascii="Calibri" w:hAnsi="Calibri" w:eastAsia="Calibri"/>
+          <w:b/>
+          <w:i w:val="0"/>
+          <w:color w:val="1F4D36"/>
+          <w:sz w:val="32"/>
+        </w:rPr>
+        <w:t>10. Forms</w:t>
+      </w:r>
+    </w:p>
+    <w:p>
+      <w:pPr>
+        <w:spacing w:before="200" w:after="80" w:line="240" w:lineRule="auto"/>
+      </w:pPr>
+      <w:r>
+        <w:rPr>
+          <w:rFonts w:ascii="Calibri" w:hAnsi="Calibri" w:eastAsia="Calibri"/>
+          <w:b/>
+          <w:i w:val="0"/>
+          <w:color w:val="1F4D36"/>
+          <w:sz w:val="26"/>
+        </w:rPr>
+        <w:t>10.1 CCP 1 log — lethality</w:t>
       </w:r>
     </w:p>
     <w:p>
@@ -4276,7 +4934,7 @@
           <w:color w:val="1E1A16"/>
           <w:sz w:val="22"/>
         </w:rPr>
-        <w:t>Limit met: yes / no. If no, lot held and Form 9.4 is completed. Reviewer __________ Date __________</w:t>
+        <w:t>Limit met: yes / no. If no, lot held and Form 10.4 is completed. Reviewer __________ Date __________</w:t>
       </w:r>
     </w:p>
     <w:p>
@@ -4291,7 +4949,7 @@
           <w:color w:val="1F4D36"/>
           <w:sz w:val="26"/>
         </w:rPr>
-        <w:t>9.2 CCP 2 log — dehydration</w:t>
+        <w:t>10.2 CCP 2 log — dehydration</w:t>
       </w:r>
     </w:p>
     <w:p>
@@ -4921,7 +5579,7 @@
           <w:color w:val="1F4D36"/>
           <w:sz w:val="26"/>
         </w:rPr>
-        <w:t>9.3 Cooler log — prerequisite, not a CCP</w:t>
+        <w:t>10.3 Cooler log — prerequisite, not a CCP</w:t>
       </w:r>
     </w:p>
     <w:p>
@@ -4951,7 +5609,7 @@
           <w:color w:val="1F4D36"/>
           <w:sz w:val="26"/>
         </w:rPr>
-        <w:t>9.4 Corrective action</w:t>
+        <w:t>10.4 Corrective action</w:t>
       </w:r>
     </w:p>
     <w:p>
@@ -5086,7 +5744,7 @@
           <w:color w:val="1F4D36"/>
           <w:sz w:val="26"/>
         </w:rPr>
-        <w:t>9.5 Pre-shipment review</w:t>
+        <w:t>10.5 Pre-shipment review</w:t>
       </w:r>
     </w:p>
     <w:p>
@@ -5195,7 +5853,7 @@
           <w:color w:val="1F4D36"/>
           <w:sz w:val="32"/>
         </w:rPr>
-        <w:t>10. Documents kept with this plan</w:t>
+        <w:t>11. Documents kept with this plan</w:t>
       </w:r>
     </w:p>
     <w:p>

</xml_diff>

<commit_message>
Complete the five inspection items in the HACCP plan.
The plan now has the signature statement, the three-lot validation sheet, the gas-oven steps, the Listeria surface program, and the instrument list. Signature and lot results stay blank for the plant.

Co-authored-by: quique2220-coder <quique2220-coder@users.noreply.github.com>
</commit_message>
<xml_diff>
--- a/haccp-plan/final/HACCP-Plan-Beef-Jerky-Final.docx
+++ b/haccp-plan/final/HACCP-Plan-Beef-Jerky-Final.docx
@@ -3649,7 +3649,7 @@
           <w:color w:val="1F4D36"/>
           <w:sz w:val="26"/>
         </w:rPr>
-        <w:t>8.1 Signature</w:t>
+        <w:t>8.1 Signature — inspection item 1</w:t>
       </w:r>
     </w:p>
     <w:p>
@@ -3664,7 +3664,7 @@
           <w:color w:val="1E1A16"/>
           <w:sz w:val="22"/>
         </w:rPr>
-        <w:t>9 CFR 417.2(d). Signing accepts this plan for this product and this gas oven.</w:t>
+        <w:t>9 CFR 417.2(d). The responsible official signs before the plan is used. The signature is in ink. A typed name is not the signature. The same person signs the scientific-support document on the same day. The plan is signed again at least once a year and whenever it is changed.</w:t>
       </w:r>
     </w:p>
     <w:p>
@@ -3679,7 +3679,37 @@
           <w:color w:val="1E1A16"/>
           <w:sz w:val="22"/>
         </w:rPr>
-        <w:t>Responsible establishment official, Jesús Canales: ______________________________________________</w:t>
+        <w:t>I am the responsible establishment official of Carne Seca Jesus Canales, LLC. I have reviewed this HACCP plan for ready-to-eat beef jerky made in this gas oven. Signing accepts the hazard analysis, the critical limits, the monitoring, the corrective actions, the verification, and the records in this plan.</w:t>
+      </w:r>
+    </w:p>
+    <w:p>
+      <w:pPr>
+        <w:spacing w:before="0" w:after="120" w:line="240" w:lineRule="auto"/>
+      </w:pPr>
+      <w:r>
+        <w:rPr>
+          <w:rFonts w:ascii="Calibri" w:hAnsi="Calibri" w:eastAsia="Calibri"/>
+          <w:b w:val="0"/>
+          <w:i w:val="0"/>
+          <w:color w:val="1E1A16"/>
+          <w:sz w:val="22"/>
+        </w:rPr>
+        <w:t>Signature, Jesús Canales: ______________________________________________</w:t>
+      </w:r>
+    </w:p>
+    <w:p>
+      <w:pPr>
+        <w:spacing w:before="0" w:after="120" w:line="240" w:lineRule="auto"/>
+      </w:pPr>
+      <w:r>
+        <w:rPr>
+          <w:rFonts w:ascii="Calibri" w:hAnsi="Calibri" w:eastAsia="Calibri"/>
+          <w:b w:val="0"/>
+          <w:i w:val="0"/>
+          <w:color w:val="1E1A16"/>
+          <w:sz w:val="22"/>
+        </w:rPr>
+        <w:t>Printed name: ______________________________________________</w:t>
       </w:r>
     </w:p>
     <w:p>
@@ -3709,7 +3739,7 @@
           <w:color w:val="1E1A16"/>
           <w:sz w:val="22"/>
         </w:rPr>
-        <w:t>Initial validation completed (blank until the in-plant lots are reviewed): ______________________________________________</w:t>
+        <w:t>Initial validation completed (blank until Section 13 is reviewed): ______________________________________________</w:t>
       </w:r>
     </w:p>
     <w:p>
@@ -5980,7 +6010,1796 @@
           <w:color w:val="1E1A16"/>
           <w:sz w:val="22"/>
         </w:rPr>
-        <w:t>The curing-and-smoking checklist is on file as a document that was reviewed and not used. The returned May plan is on file as the plan this one replaces.</w:t>
+        <w:t>The curing-and-smoking checklist is on file as a document that was reviewed and not used. The returned May plan is on file as the plan this one replaces. Sections 12 through 16 complete the five items an inspector still checks before this plan can be used.</w:t>
+      </w:r>
+    </w:p>
+    <w:p>
+      <w:pPr>
+        <w:spacing w:before="280" w:after="120" w:line="240" w:lineRule="auto"/>
+      </w:pPr>
+      <w:r>
+        <w:rPr>
+          <w:rFonts w:ascii="Calibri" w:hAnsi="Calibri" w:eastAsia="Calibri"/>
+          <w:b/>
+          <w:i w:val="0"/>
+          <w:color w:val="1F4D36"/>
+          <w:sz w:val="32"/>
+        </w:rPr>
+        <w:t>12. Item 1 — signature</w:t>
+      </w:r>
+    </w:p>
+    <w:p>
+      <w:pPr>
+        <w:spacing w:before="0" w:after="120" w:line="240" w:lineRule="auto"/>
+      </w:pPr>
+      <w:r>
+        <w:rPr>
+          <w:rFonts w:ascii="Calibri" w:hAnsi="Calibri" w:eastAsia="Calibri"/>
+          <w:b w:val="0"/>
+          <w:i w:val="0"/>
+          <w:color w:val="1E1A16"/>
+          <w:sz w:val="22"/>
+        </w:rPr>
+        <w:t>The signature block is Section 8.1 of this plan and Section 6 of the scientific support. Both are signed in ink by Jesús Canales before the packet is sent. The validation date on that block stays blank until the three lots in Section 13 have been reviewed.</w:t>
+      </w:r>
+    </w:p>
+    <w:p>
+      <w:pPr>
+        <w:spacing w:before="280" w:after="120" w:line="240" w:lineRule="auto"/>
+      </w:pPr>
+      <w:r>
+        <w:rPr>
+          <w:rFonts w:ascii="Calibri" w:hAnsi="Calibri" w:eastAsia="Calibri"/>
+          <w:b/>
+          <w:i w:val="0"/>
+          <w:color w:val="1F4D36"/>
+          <w:sz w:val="32"/>
+        </w:rPr>
+        <w:t>13. Item 2 — in-plant validation</w:t>
+      </w:r>
+    </w:p>
+    <w:p>
+      <w:pPr>
+        <w:spacing w:before="0" w:after="120" w:line="240" w:lineRule="auto"/>
+      </w:pPr>
+      <w:r>
+        <w:rPr>
+          <w:rFonts w:ascii="Calibri" w:hAnsi="Calibri" w:eastAsia="Calibri"/>
+          <w:b w:val="0"/>
+          <w:i w:val="0"/>
+          <w:color w:val="1E1A16"/>
+          <w:sz w:val="22"/>
+        </w:rPr>
+        <w:t>9 CFR 417.4(a)(1). The scientific support is already written. The in-plant part is three lots on this gas oven, with the load and the strip thickness that will be used in production. A lot that misses a limit does not count. The cause is corrected before the next validation lot. The validation date is written only after all three lots meet every limit and Jesús Canales reviews the logs.</w:t>
+      </w:r>
+    </w:p>
+    <w:p>
+      <w:pPr>
+        <w:spacing w:after="40" w:before="0"/>
+        <w:ind w:left="360"/>
+      </w:pPr>
+      <w:r>
+        <w:rPr>
+          <w:rFonts w:ascii="Calibri" w:hAnsi="Calibri" w:eastAsia="Calibri"/>
+          <w:b w:val="0"/>
+          <w:i w:val="0"/>
+          <w:color w:val="1E1A16"/>
+          <w:sz w:val="22"/>
+        </w:rPr>
+        <w:t>• Lot 1 also finds the cold spot. The same thick strip size is probed in three places in the oven: front, center, and back, or top, middle, and bottom if that is how the racks sit. The place that reaches 160°F last is the cold spot. It is written here: __________.</w:t>
+      </w:r>
+    </w:p>
+    <w:p>
+      <w:pPr>
+        <w:spacing w:after="40" w:before="0"/>
+        <w:ind w:left="360"/>
+      </w:pPr>
+      <w:r>
+        <w:rPr>
+          <w:rFonts w:ascii="Calibri" w:hAnsi="Calibri" w:eastAsia="Calibri"/>
+          <w:b w:val="0"/>
+          <w:i w:val="0"/>
+          <w:color w:val="1E1A16"/>
+          <w:sz w:val="22"/>
+        </w:rPr>
+        <w:t>• Lots 2 and 3 use that cold spot and the thickest strip. Each lot completes Form 10.1 and Form 10.2.</w:t>
+      </w:r>
+    </w:p>
+    <w:p>
+      <w:pPr>
+        <w:spacing w:after="40" w:before="0"/>
+        <w:ind w:left="360"/>
+      </w:pPr>
+      <w:r>
+        <w:rPr>
+          <w:rFonts w:ascii="Calibri" w:hAnsi="Calibri" w:eastAsia="Calibri"/>
+          <w:b w:val="0"/>
+          <w:i w:val="0"/>
+          <w:color w:val="1E1A16"/>
+          <w:sz w:val="22"/>
+        </w:rPr>
+        <w:t>• All three instruments in Section 16 have passed their checks before lot 1 starts.</w:t>
+      </w:r>
+    </w:p>
+    <w:tbl>
+      <w:tblPr>
+        <w:tblStyle w:val="TableGrid"/>
+        <w:tblW w:type="auto" w:w="0"/>
+        <w:tblLook w:firstColumn="1" w:firstRow="1" w:lastColumn="0" w:lastRow="0" w:noHBand="0" w:noVBand="1" w:val="04A0"/>
+      </w:tblPr>
+      <w:tblGrid>
+        <w:gridCol w:w="1738"/>
+        <w:gridCol w:w="1738"/>
+        <w:gridCol w:w="1738"/>
+        <w:gridCol w:w="1738"/>
+        <w:gridCol w:w="1738"/>
+        <w:gridCol w:w="1738"/>
+      </w:tblGrid>
+      <w:tr>
+        <w:trPr>
+          <w:cantSplit/>
+        </w:trPr>
+        <w:tc>
+          <w:tcPr>
+            <w:tcW w:type="dxa" w:w="1738"/>
+            <w:shd w:fill="1F4D36" w:val="clear"/>
+          </w:tcPr>
+          <w:p>
+            <w:r/>
+            <w:r>
+              <w:rPr>
+                <w:rFonts w:ascii="Calibri" w:hAnsi="Calibri" w:eastAsia="Calibri"/>
+                <w:b/>
+                <w:i w:val="0"/>
+                <w:color w:val="FFFFFF"/>
+                <w:sz w:val="18"/>
+              </w:rPr>
+              <w:t>Validation lot</w:t>
+            </w:r>
+          </w:p>
+        </w:tc>
+        <w:tc>
+          <w:tcPr>
+            <w:tcW w:type="dxa" w:w="1738"/>
+            <w:shd w:fill="1F4D36" w:val="clear"/>
+          </w:tcPr>
+          <w:p>
+            <w:r/>
+            <w:r>
+              <w:rPr>
+                <w:rFonts w:ascii="Calibri" w:hAnsi="Calibri" w:eastAsia="Calibri"/>
+                <w:b/>
+                <w:i w:val="0"/>
+                <w:color w:val="FFFFFF"/>
+                <w:sz w:val="18"/>
+              </w:rPr>
+              <w:t>Date</w:t>
+            </w:r>
+          </w:p>
+        </w:tc>
+        <w:tc>
+          <w:tcPr>
+            <w:tcW w:type="dxa" w:w="1738"/>
+            <w:shd w:fill="1F4D36" w:val="clear"/>
+          </w:tcPr>
+          <w:p>
+            <w:r/>
+            <w:r>
+              <w:rPr>
+                <w:rFonts w:ascii="Calibri" w:hAnsi="Calibri" w:eastAsia="Calibri"/>
+                <w:b/>
+                <w:i w:val="0"/>
+                <w:color w:val="FFFFFF"/>
+                <w:sz w:val="18"/>
+              </w:rPr>
+              <w:t>Load and thickness</w:t>
+            </w:r>
+          </w:p>
+        </w:tc>
+        <w:tc>
+          <w:tcPr>
+            <w:tcW w:type="dxa" w:w="1738"/>
+            <w:shd w:fill="1F4D36" w:val="clear"/>
+          </w:tcPr>
+          <w:p>
+            <w:r/>
+            <w:r>
+              <w:rPr>
+                <w:rFonts w:ascii="Calibri" w:hAnsi="Calibri" w:eastAsia="Calibri"/>
+                <w:b/>
+                <w:i w:val="0"/>
+                <w:color w:val="FFFFFF"/>
+                <w:sz w:val="18"/>
+              </w:rPr>
+              <w:t>CCP 1 met</w:t>
+            </w:r>
+          </w:p>
+        </w:tc>
+        <w:tc>
+          <w:tcPr>
+            <w:tcW w:type="dxa" w:w="1738"/>
+            <w:shd w:fill="1F4D36" w:val="clear"/>
+          </w:tcPr>
+          <w:p>
+            <w:r/>
+            <w:r>
+              <w:rPr>
+                <w:rFonts w:ascii="Calibri" w:hAnsi="Calibri" w:eastAsia="Calibri"/>
+                <w:b/>
+                <w:i w:val="0"/>
+                <w:color w:val="FFFFFF"/>
+                <w:sz w:val="18"/>
+              </w:rPr>
+              <w:t>CCP 2 met</w:t>
+            </w:r>
+          </w:p>
+        </w:tc>
+        <w:tc>
+          <w:tcPr>
+            <w:tcW w:type="dxa" w:w="1738"/>
+            <w:shd w:fill="1F4D36" w:val="clear"/>
+          </w:tcPr>
+          <w:p>
+            <w:r/>
+            <w:r>
+              <w:rPr>
+                <w:rFonts w:ascii="Calibri" w:hAnsi="Calibri" w:eastAsia="Calibri"/>
+                <w:b/>
+                <w:i w:val="0"/>
+                <w:color w:val="FFFFFF"/>
+                <w:sz w:val="18"/>
+              </w:rPr>
+              <w:t>Reviewer</w:t>
+            </w:r>
+          </w:p>
+        </w:tc>
+      </w:tr>
+      <w:tr>
+        <w:trPr>
+          <w:cantSplit/>
+        </w:trPr>
+        <w:tc>
+          <w:tcPr>
+            <w:tcW w:type="dxa" w:w="1738"/>
+          </w:tcPr>
+          <w:p>
+            <w:r/>
+            <w:r>
+              <w:rPr>
+                <w:rFonts w:ascii="Calibri" w:hAnsi="Calibri" w:eastAsia="Calibri"/>
+                <w:b w:val="0"/>
+                <w:i w:val="0"/>
+                <w:color w:val="1E1A16"/>
+                <w:sz w:val="18"/>
+              </w:rPr>
+              <w:t>1 (cold spot)</w:t>
+            </w:r>
+          </w:p>
+        </w:tc>
+        <w:tc>
+          <w:tcPr>
+            <w:tcW w:type="dxa" w:w="1738"/>
+          </w:tcPr>
+          <w:p>
+            <w:r/>
+            <w:r>
+              <w:rPr>
+                <w:rFonts w:ascii="Calibri" w:hAnsi="Calibri" w:eastAsia="Calibri"/>
+                <w:b w:val="0"/>
+                <w:i w:val="0"/>
+                <w:color w:val="1E1A16"/>
+                <w:sz w:val="18"/>
+              </w:rPr>
+            </w:r>
+          </w:p>
+        </w:tc>
+        <w:tc>
+          <w:tcPr>
+            <w:tcW w:type="dxa" w:w="1738"/>
+          </w:tcPr>
+          <w:p>
+            <w:r/>
+            <w:r>
+              <w:rPr>
+                <w:rFonts w:ascii="Calibri" w:hAnsi="Calibri" w:eastAsia="Calibri"/>
+                <w:b w:val="0"/>
+                <w:i w:val="0"/>
+                <w:color w:val="1E1A16"/>
+                <w:sz w:val="18"/>
+              </w:rPr>
+            </w:r>
+          </w:p>
+        </w:tc>
+        <w:tc>
+          <w:tcPr>
+            <w:tcW w:type="dxa" w:w="1738"/>
+          </w:tcPr>
+          <w:p>
+            <w:r/>
+            <w:r>
+              <w:rPr>
+                <w:rFonts w:ascii="Calibri" w:hAnsi="Calibri" w:eastAsia="Calibri"/>
+                <w:b w:val="0"/>
+                <w:i w:val="0"/>
+                <w:color w:val="1E1A16"/>
+                <w:sz w:val="18"/>
+              </w:rPr>
+              <w:t>yes / no</w:t>
+            </w:r>
+          </w:p>
+        </w:tc>
+        <w:tc>
+          <w:tcPr>
+            <w:tcW w:type="dxa" w:w="1738"/>
+          </w:tcPr>
+          <w:p>
+            <w:r/>
+            <w:r>
+              <w:rPr>
+                <w:rFonts w:ascii="Calibri" w:hAnsi="Calibri" w:eastAsia="Calibri"/>
+                <w:b w:val="0"/>
+                <w:i w:val="0"/>
+                <w:color w:val="1E1A16"/>
+                <w:sz w:val="18"/>
+              </w:rPr>
+              <w:t>yes / no</w:t>
+            </w:r>
+          </w:p>
+        </w:tc>
+        <w:tc>
+          <w:tcPr>
+            <w:tcW w:type="dxa" w:w="1738"/>
+          </w:tcPr>
+          <w:p>
+            <w:r/>
+            <w:r>
+              <w:rPr>
+                <w:rFonts w:ascii="Calibri" w:hAnsi="Calibri" w:eastAsia="Calibri"/>
+                <w:b w:val="0"/>
+                <w:i w:val="0"/>
+                <w:color w:val="1E1A16"/>
+                <w:sz w:val="18"/>
+              </w:rPr>
+            </w:r>
+          </w:p>
+        </w:tc>
+      </w:tr>
+      <w:tr>
+        <w:trPr>
+          <w:cantSplit/>
+        </w:trPr>
+        <w:tc>
+          <w:tcPr>
+            <w:tcW w:type="dxa" w:w="1738"/>
+            <w:shd w:fill="F4F1EA" w:val="clear"/>
+          </w:tcPr>
+          <w:p>
+            <w:r/>
+            <w:r>
+              <w:rPr>
+                <w:rFonts w:ascii="Calibri" w:hAnsi="Calibri" w:eastAsia="Calibri"/>
+                <w:b w:val="0"/>
+                <w:i w:val="0"/>
+                <w:color w:val="1E1A16"/>
+                <w:sz w:val="18"/>
+              </w:rPr>
+              <w:t>2</w:t>
+            </w:r>
+          </w:p>
+        </w:tc>
+        <w:tc>
+          <w:tcPr>
+            <w:tcW w:type="dxa" w:w="1738"/>
+            <w:shd w:fill="F4F1EA" w:val="clear"/>
+          </w:tcPr>
+          <w:p>
+            <w:r/>
+            <w:r>
+              <w:rPr>
+                <w:rFonts w:ascii="Calibri" w:hAnsi="Calibri" w:eastAsia="Calibri"/>
+                <w:b w:val="0"/>
+                <w:i w:val="0"/>
+                <w:color w:val="1E1A16"/>
+                <w:sz w:val="18"/>
+              </w:rPr>
+            </w:r>
+          </w:p>
+        </w:tc>
+        <w:tc>
+          <w:tcPr>
+            <w:tcW w:type="dxa" w:w="1738"/>
+            <w:shd w:fill="F4F1EA" w:val="clear"/>
+          </w:tcPr>
+          <w:p>
+            <w:r/>
+            <w:r>
+              <w:rPr>
+                <w:rFonts w:ascii="Calibri" w:hAnsi="Calibri" w:eastAsia="Calibri"/>
+                <w:b w:val="0"/>
+                <w:i w:val="0"/>
+                <w:color w:val="1E1A16"/>
+                <w:sz w:val="18"/>
+              </w:rPr>
+            </w:r>
+          </w:p>
+        </w:tc>
+        <w:tc>
+          <w:tcPr>
+            <w:tcW w:type="dxa" w:w="1738"/>
+            <w:shd w:fill="F4F1EA" w:val="clear"/>
+          </w:tcPr>
+          <w:p>
+            <w:r/>
+            <w:r>
+              <w:rPr>
+                <w:rFonts w:ascii="Calibri" w:hAnsi="Calibri" w:eastAsia="Calibri"/>
+                <w:b w:val="0"/>
+                <w:i w:val="0"/>
+                <w:color w:val="1E1A16"/>
+                <w:sz w:val="18"/>
+              </w:rPr>
+              <w:t>yes / no</w:t>
+            </w:r>
+          </w:p>
+        </w:tc>
+        <w:tc>
+          <w:tcPr>
+            <w:tcW w:type="dxa" w:w="1738"/>
+            <w:shd w:fill="F4F1EA" w:val="clear"/>
+          </w:tcPr>
+          <w:p>
+            <w:r/>
+            <w:r>
+              <w:rPr>
+                <w:rFonts w:ascii="Calibri" w:hAnsi="Calibri" w:eastAsia="Calibri"/>
+                <w:b w:val="0"/>
+                <w:i w:val="0"/>
+                <w:color w:val="1E1A16"/>
+                <w:sz w:val="18"/>
+              </w:rPr>
+              <w:t>yes / no</w:t>
+            </w:r>
+          </w:p>
+        </w:tc>
+        <w:tc>
+          <w:tcPr>
+            <w:tcW w:type="dxa" w:w="1738"/>
+            <w:shd w:fill="F4F1EA" w:val="clear"/>
+          </w:tcPr>
+          <w:p>
+            <w:r/>
+            <w:r>
+              <w:rPr>
+                <w:rFonts w:ascii="Calibri" w:hAnsi="Calibri" w:eastAsia="Calibri"/>
+                <w:b w:val="0"/>
+                <w:i w:val="0"/>
+                <w:color w:val="1E1A16"/>
+                <w:sz w:val="18"/>
+              </w:rPr>
+            </w:r>
+          </w:p>
+        </w:tc>
+      </w:tr>
+      <w:tr>
+        <w:trPr>
+          <w:cantSplit/>
+        </w:trPr>
+        <w:tc>
+          <w:tcPr>
+            <w:tcW w:type="dxa" w:w="1738"/>
+          </w:tcPr>
+          <w:p>
+            <w:r/>
+            <w:r>
+              <w:rPr>
+                <w:rFonts w:ascii="Calibri" w:hAnsi="Calibri" w:eastAsia="Calibri"/>
+                <w:b w:val="0"/>
+                <w:i w:val="0"/>
+                <w:color w:val="1E1A16"/>
+                <w:sz w:val="18"/>
+              </w:rPr>
+              <w:t>3</w:t>
+            </w:r>
+          </w:p>
+        </w:tc>
+        <w:tc>
+          <w:tcPr>
+            <w:tcW w:type="dxa" w:w="1738"/>
+          </w:tcPr>
+          <w:p>
+            <w:r/>
+            <w:r>
+              <w:rPr>
+                <w:rFonts w:ascii="Calibri" w:hAnsi="Calibri" w:eastAsia="Calibri"/>
+                <w:b w:val="0"/>
+                <w:i w:val="0"/>
+                <w:color w:val="1E1A16"/>
+                <w:sz w:val="18"/>
+              </w:rPr>
+            </w:r>
+          </w:p>
+        </w:tc>
+        <w:tc>
+          <w:tcPr>
+            <w:tcW w:type="dxa" w:w="1738"/>
+          </w:tcPr>
+          <w:p>
+            <w:r/>
+            <w:r>
+              <w:rPr>
+                <w:rFonts w:ascii="Calibri" w:hAnsi="Calibri" w:eastAsia="Calibri"/>
+                <w:b w:val="0"/>
+                <w:i w:val="0"/>
+                <w:color w:val="1E1A16"/>
+                <w:sz w:val="18"/>
+              </w:rPr>
+            </w:r>
+          </w:p>
+        </w:tc>
+        <w:tc>
+          <w:tcPr>
+            <w:tcW w:type="dxa" w:w="1738"/>
+          </w:tcPr>
+          <w:p>
+            <w:r/>
+            <w:r>
+              <w:rPr>
+                <w:rFonts w:ascii="Calibri" w:hAnsi="Calibri" w:eastAsia="Calibri"/>
+                <w:b w:val="0"/>
+                <w:i w:val="0"/>
+                <w:color w:val="1E1A16"/>
+                <w:sz w:val="18"/>
+              </w:rPr>
+              <w:t>yes / no</w:t>
+            </w:r>
+          </w:p>
+        </w:tc>
+        <w:tc>
+          <w:tcPr>
+            <w:tcW w:type="dxa" w:w="1738"/>
+          </w:tcPr>
+          <w:p>
+            <w:r/>
+            <w:r>
+              <w:rPr>
+                <w:rFonts w:ascii="Calibri" w:hAnsi="Calibri" w:eastAsia="Calibri"/>
+                <w:b w:val="0"/>
+                <w:i w:val="0"/>
+                <w:color w:val="1E1A16"/>
+                <w:sz w:val="18"/>
+              </w:rPr>
+              <w:t>yes / no</w:t>
+            </w:r>
+          </w:p>
+        </w:tc>
+        <w:tc>
+          <w:tcPr>
+            <w:tcW w:type="dxa" w:w="1738"/>
+          </w:tcPr>
+          <w:p>
+            <w:r/>
+            <w:r>
+              <w:rPr>
+                <w:rFonts w:ascii="Calibri" w:hAnsi="Calibri" w:eastAsia="Calibri"/>
+                <w:b w:val="0"/>
+                <w:i w:val="0"/>
+                <w:color w:val="1E1A16"/>
+                <w:sz w:val="18"/>
+              </w:rPr>
+            </w:r>
+          </w:p>
+        </w:tc>
+      </w:tr>
+    </w:tbl>
+    <w:p>
+      <w:pPr>
+        <w:spacing w:after="80"/>
+      </w:pPr>
+    </w:p>
+    <w:p>
+      <w:pPr>
+        <w:spacing w:before="0" w:after="120" w:line="240" w:lineRule="auto"/>
+      </w:pPr>
+      <w:r>
+        <w:rPr>
+          <w:rFonts w:ascii="Calibri" w:hAnsi="Calibri" w:eastAsia="Calibri"/>
+          <w:b w:val="0"/>
+          <w:i w:val="0"/>
+          <w:color w:val="1E1A16"/>
+          <w:sz w:val="22"/>
+        </w:rPr>
+        <w:t>Cold spot found on lot 1: __________. Thickness used: __________. Validation date, filled only when all three lots passed: __________.</w:t>
+      </w:r>
+    </w:p>
+    <w:p>
+      <w:pPr>
+        <w:spacing w:before="280" w:after="120" w:line="240" w:lineRule="auto"/>
+      </w:pPr>
+      <w:r>
+        <w:rPr>
+          <w:rFonts w:ascii="Calibri" w:hAnsi="Calibri" w:eastAsia="Calibri"/>
+          <w:b/>
+          <w:i w:val="0"/>
+          <w:color w:val="1F4D36"/>
+          <w:sz w:val="32"/>
+        </w:rPr>
+        <w:t>14. Item 3 — how this gas oven is run</w:t>
+      </w:r>
+    </w:p>
+    <w:p>
+      <w:pPr>
+        <w:spacing w:before="0" w:after="120" w:line="240" w:lineRule="auto"/>
+      </w:pPr>
+      <w:r>
+        <w:rPr>
+          <w:rFonts w:ascii="Calibri" w:hAnsi="Calibri" w:eastAsia="Calibri"/>
+          <w:b w:val="0"/>
+          <w:i w:val="0"/>
+          <w:color w:val="1E1A16"/>
+          <w:sz w:val="22"/>
+        </w:rPr>
+        <w:t>The meat is not dehydrated until the cook in the sealed bag has passed. One lot follows these steps.</w:t>
+      </w:r>
+    </w:p>
+    <w:p>
+      <w:pPr>
+        <w:spacing w:after="40" w:before="0"/>
+        <w:ind w:left="360"/>
+      </w:pPr>
+      <w:r>
+        <w:rPr>
+          <w:rFonts w:ascii="Calibri" w:hAnsi="Calibri" w:eastAsia="Calibri"/>
+          <w:b w:val="0"/>
+          <w:i w:val="0"/>
+          <w:color w:val="1E1A16"/>
+          <w:sz w:val="22"/>
+        </w:rPr>
+        <w:t>• Hold the raw beef at or below 41°F. Weigh the formula in Section 3.1 onto the batch sheet.</w:t>
+      </w:r>
+    </w:p>
+    <w:p>
+      <w:pPr>
+        <w:spacing w:after="40" w:before="0"/>
+        <w:ind w:left="360"/>
+      </w:pPr>
+      <w:r>
+        <w:rPr>
+          <w:rFonts w:ascii="Calibri" w:hAnsi="Calibri" w:eastAsia="Calibri"/>
+          <w:b w:val="0"/>
+          <w:i w:val="0"/>
+          <w:color w:val="1E1A16"/>
+          <w:sz w:val="22"/>
+        </w:rPr>
+        <w:t>• Put the thickest strip in the cold spot. Place the probe in the center of that strip. Seal the moisture-impermeable bag around the meat and the probe cable.</w:t>
+      </w:r>
+    </w:p>
+    <w:p>
+      <w:pPr>
+        <w:spacing w:after="40" w:before="0"/>
+        <w:ind w:left="360"/>
+      </w:pPr>
+      <w:r>
+        <w:rPr>
+          <w:rFonts w:ascii="Calibri" w:hAnsi="Calibri" w:eastAsia="Calibri"/>
+          <w:b w:val="0"/>
+          <w:i w:val="0"/>
+          <w:color w:val="1E1A16"/>
+          <w:sz w:val="22"/>
+        </w:rPr>
+        <w:t>• Put the sealed bag in the heated gas oven. Leave the burner vent as the oven requires. Do not treat this oven as a sealed oven.</w:t>
+      </w:r>
+    </w:p>
+    <w:p>
+      <w:pPr>
+        <w:spacing w:after="40" w:before="0"/>
+        <w:ind w:left="360"/>
+      </w:pPr>
+      <w:r>
+        <w:rPr>
+          <w:rFonts w:ascii="Calibri" w:hAnsi="Calibri" w:eastAsia="Calibri"/>
+          <w:b w:val="0"/>
+          <w:i w:val="0"/>
+          <w:color w:val="1E1A16"/>
+          <w:sz w:val="22"/>
+        </w:rPr>
+        <w:t>• Write the clock at 50°F, at 130°F, and at 160°F or above. Open the bag only after 160°F is written and the come-up is 6 hours or less.</w:t>
+      </w:r>
+    </w:p>
+    <w:p>
+      <w:pPr>
+        <w:spacing w:after="40" w:before="0"/>
+        <w:ind w:left="360"/>
+      </w:pPr>
+      <w:r>
+        <w:rPr>
+          <w:rFonts w:ascii="Calibri" w:hAnsi="Calibri" w:eastAsia="Calibri"/>
+          <w:b w:val="0"/>
+          <w:i w:val="0"/>
+          <w:color w:val="1E1A16"/>
+          <w:sz w:val="22"/>
+        </w:rPr>
+        <w:t>• Rack the strips so air can dry them. Keep the dry-bulb thermometer at 170°F or above. Read it before the strips come out.</w:t>
+      </w:r>
+    </w:p>
+    <w:p>
+      <w:pPr>
+        <w:spacing w:after="40" w:before="0"/>
+        <w:ind w:left="360"/>
+      </w:pPr>
+      <w:r>
+        <w:rPr>
+          <w:rFonts w:ascii="Calibri" w:hAnsi="Calibri" w:eastAsia="Calibri"/>
+          <w:b w:val="0"/>
+          <w:i w:val="0"/>
+          <w:color w:val="1E1A16"/>
+          <w:sz w:val="22"/>
+        </w:rPr>
+        <w:t>• Cool six pieces, covered, to the meter temperature. Record the water activity. Pack only if the highest reading is 0.85 or less and the pre-shipment review is signed.</w:t>
+      </w:r>
+    </w:p>
+    <w:p>
+      <w:pPr>
+        <w:spacing w:before="0" w:after="120" w:line="240" w:lineRule="auto"/>
+      </w:pPr>
+      <w:r>
+        <w:rPr>
+          <w:rFonts w:ascii="Calibri" w:hAnsi="Calibri" w:eastAsia="Calibri"/>
+          <w:b w:val="0"/>
+          <w:i w:val="0"/>
+          <w:color w:val="1E1A16"/>
+          <w:sz w:val="22"/>
+        </w:rPr>
+        <w:t>Para quien opera el horno: la carne no se seca hasta que la bolsa cerrada llegó a 160°F por dentro. La sonda se queda en la tira más gruesa. La bolsa se abre después de anotar 160°F y de comprobar que de 50°F a 130°F pasaron 6 horas o menos. Luego se seca a 170°F en el aire del horno y se miden seis piezas. Si la más alta pasa de 0.85, no se empaca.</w:t>
+      </w:r>
+    </w:p>
+    <w:p>
+      <w:pPr>
+        <w:spacing w:before="280" w:after="120" w:line="240" w:lineRule="auto"/>
+      </w:pPr>
+      <w:r>
+        <w:rPr>
+          <w:rFonts w:ascii="Calibri" w:hAnsi="Calibri" w:eastAsia="Calibri"/>
+          <w:b/>
+          <w:i w:val="0"/>
+          <w:color w:val="1F4D36"/>
+          <w:sz w:val="32"/>
+        </w:rPr>
+        <w:t>15. Item 4 — Listeria sanitation program</w:t>
+      </w:r>
+    </w:p>
+    <w:p>
+      <w:pPr>
+        <w:spacing w:before="0" w:after="120" w:line="240" w:lineRule="auto"/>
+      </w:pPr>
+      <w:r>
+        <w:rPr>
+          <w:rFonts w:ascii="Calibri" w:hAnsi="Calibri" w:eastAsia="Calibri"/>
+          <w:b w:val="0"/>
+          <w:i w:val="0"/>
+          <w:color w:val="1E1A16"/>
+          <w:sz w:val="22"/>
+        </w:rPr>
+        <w:t>After the bag is opened, the jerky is post-lethality exposed. This plant uses Alternative 2, Choice 2, of 9 CFR 430.4. The antimicrobial process is the finished water activity of 0.85 or less, which is below the 0.92 growth minimum for Listeria monocytogenes. Sanitation in the ready-to-eat area goes with that process. This section is the sanitation program the regulation requires for that choice.</w:t>
+      </w:r>
+    </w:p>
+    <w:p>
+      <w:pPr>
+        <w:spacing w:before="200" w:after="80" w:line="240" w:lineRule="auto"/>
+      </w:pPr>
+      <w:r>
+        <w:rPr>
+          <w:rFonts w:ascii="Calibri" w:hAnsi="Calibri" w:eastAsia="Calibri"/>
+          <w:b/>
+          <w:i w:val="0"/>
+          <w:color w:val="1F4D36"/>
+          <w:sz w:val="26"/>
+        </w:rPr>
+        <w:t>15.1 Clean before the bag is opened</w:t>
+      </w:r>
+    </w:p>
+    <w:p>
+      <w:pPr>
+        <w:spacing w:before="0" w:after="120" w:line="240" w:lineRule="auto"/>
+      </w:pPr>
+      <w:r>
+        <w:rPr>
+          <w:rFonts w:ascii="Calibri" w:hAnsi="Calibri" w:eastAsia="Calibri"/>
+          <w:b w:val="0"/>
+          <w:i w:val="0"/>
+          <w:color w:val="1E1A16"/>
+          <w:sz w:val="22"/>
+        </w:rPr>
+        <w:t>On each production day, before exposed jerky is handled, the person in charge looks at the racks, the table, the scale, and the utensils. They are clean to sight and touch. The result is written on the pre-operational line of Form 10.6. Jerky is not laid on a surface that fails that check.</w:t>
+      </w:r>
+    </w:p>
+    <w:p>
+      <w:pPr>
+        <w:spacing w:before="200" w:after="80" w:line="240" w:lineRule="auto"/>
+      </w:pPr>
+      <w:r>
+        <w:rPr>
+          <w:rFonts w:ascii="Calibri" w:hAnsi="Calibri" w:eastAsia="Calibri"/>
+          <w:b/>
+          <w:i w:val="0"/>
+          <w:color w:val="1F4D36"/>
+          <w:sz w:val="26"/>
+        </w:rPr>
+        <w:t>15.2 Food-contact surface testing</w:t>
+      </w:r>
+    </w:p>
+    <w:p>
+      <w:pPr>
+        <w:spacing w:before="0" w:after="120" w:line="240" w:lineRule="auto"/>
+      </w:pPr>
+      <w:r>
+        <w:rPr>
+          <w:rFonts w:ascii="Calibri" w:hAnsi="Calibri" w:eastAsia="Calibri"/>
+          <w:b w:val="0"/>
+          <w:i w:val="0"/>
+          <w:color w:val="1E1A16"/>
+          <w:sz w:val="22"/>
+        </w:rPr>
+        <w:t>The laboratory test is for Listeria spp. on food-contact surfaces. It is not a test of the jerky in the bag.</w:t>
+      </w:r>
+    </w:p>
+    <w:p>
+      <w:pPr>
+        <w:spacing w:after="40" w:before="0"/>
+        <w:ind w:left="360"/>
+      </w:pPr>
+      <w:r>
+        <w:rPr>
+          <w:rFonts w:ascii="Calibri" w:hAnsi="Calibri" w:eastAsia="Calibri"/>
+          <w:b w:val="0"/>
+          <w:i w:val="0"/>
+          <w:color w:val="1E1A16"/>
+          <w:sz w:val="22"/>
+        </w:rPr>
+        <w:t>• Frequency. One sampling event in the first validation week, before a lot ships, and then one event each calendar quarter while jerky is made. There is one line.</w:t>
+      </w:r>
+    </w:p>
+    <w:p>
+      <w:pPr>
+        <w:spacing w:after="40" w:before="0"/>
+        <w:ind w:left="360"/>
+      </w:pPr>
+      <w:r>
+        <w:rPr>
+          <w:rFonts w:ascii="Calibri" w:hAnsi="Calibri" w:eastAsia="Calibri"/>
+          <w:b w:val="0"/>
+          <w:i w:val="0"/>
+          <w:color w:val="1E1A16"/>
+          <w:sz w:val="22"/>
+        </w:rPr>
+        <w:t>• Why this frequency is enough. FSIS recommends quarterly food-contact testing per line for Alternative 2. This plant has one line. The finished water activity prevents growth of Listeria monocytogenes during storage. The first event is done before product ships.</w:t>
+      </w:r>
+    </w:p>
+    <w:p>
+      <w:pPr>
+        <w:spacing w:after="40" w:before="0"/>
+        <w:ind w:left="360"/>
+      </w:pPr>
+      <w:r>
+        <w:rPr>
+          <w:rFonts w:ascii="Calibri" w:hAnsi="Calibri" w:eastAsia="Calibri"/>
+          <w:b w:val="0"/>
+          <w:i w:val="0"/>
+          <w:color w:val="1E1A16"/>
+          <w:sz w:val="22"/>
+        </w:rPr>
+        <w:t>• Sites, each event. (1) The rack or tray that holds jerky after the bag is opened. (2) The table where jerky is placed before packing. (3) The scale pan or the tongs that touch the jerky. If a glove or the sealer touches the meat, that surface is added.</w:t>
+      </w:r>
+    </w:p>
+    <w:p>
+      <w:pPr>
+        <w:spacing w:after="40" w:before="0"/>
+        <w:ind w:left="360"/>
+      </w:pPr>
+      <w:r>
+        <w:rPr>
+          <w:rFonts w:ascii="Calibri" w:hAnsi="Calibri" w:eastAsia="Calibri"/>
+          <w:b w:val="0"/>
+          <w:i w:val="0"/>
+          <w:color w:val="1E1A16"/>
+          <w:sz w:val="22"/>
+        </w:rPr>
+        <w:t>• Size. Up to 12 inches by 12 inches of the food-contact area. If the surface is smaller, the whole food-contact face is swabbed.</w:t>
+      </w:r>
+    </w:p>
+    <w:p>
+      <w:pPr>
+        <w:spacing w:before="200" w:after="80" w:line="240" w:lineRule="auto"/>
+      </w:pPr>
+      <w:r>
+        <w:rPr>
+          <w:rFonts w:ascii="Calibri" w:hAnsi="Calibri" w:eastAsia="Calibri"/>
+          <w:b/>
+          <w:i w:val="0"/>
+          <w:color w:val="1F4D36"/>
+          <w:sz w:val="26"/>
+        </w:rPr>
+        <w:t>15.3 When a swab is positive</w:t>
+      </w:r>
+    </w:p>
+    <w:p>
+      <w:pPr>
+        <w:spacing w:before="0" w:after="120" w:line="240" w:lineRule="auto"/>
+      </w:pPr>
+      <w:r>
+        <w:rPr>
+          <w:rFonts w:ascii="Calibri" w:hAnsi="Calibri" w:eastAsia="Calibri"/>
+          <w:b w:val="0"/>
+          <w:i w:val="0"/>
+          <w:color w:val="1E1A16"/>
+          <w:sz w:val="22"/>
+        </w:rPr>
+        <w:t>A positive Listeria spp. result on a food-contact surface: packing stops, the lot in the room is held, the site is cleaned and sanitized, and the site is swabbed again before the next lot. If that second swab is positive, or if the laboratory reports Listeria monocytogenes, the held lot does not ship. Jesús Canales tells the inspector. The lot is not released by a finished-product laboratory test. Disposition is written on Form 10.4 and Form 10.6.</w:t>
+      </w:r>
+    </w:p>
+    <w:tbl>
+      <w:tblPr>
+        <w:tblStyle w:val="TableGrid"/>
+        <w:tblW w:type="auto" w:w="0"/>
+        <w:tblLook w:firstColumn="1" w:firstRow="1" w:lastColumn="0" w:lastRow="0" w:noHBand="0" w:noVBand="1" w:val="04A0"/>
+      </w:tblPr>
+      <w:tblGrid>
+        <w:gridCol w:w="1738"/>
+        <w:gridCol w:w="1738"/>
+        <w:gridCol w:w="1738"/>
+        <w:gridCol w:w="1738"/>
+        <w:gridCol w:w="1738"/>
+        <w:gridCol w:w="1738"/>
+      </w:tblGrid>
+      <w:tr>
+        <w:trPr>
+          <w:cantSplit/>
+        </w:trPr>
+        <w:tc>
+          <w:tcPr>
+            <w:tcW w:type="dxa" w:w="1738"/>
+            <w:shd w:fill="1F4D36" w:val="clear"/>
+          </w:tcPr>
+          <w:p>
+            <w:r/>
+            <w:r>
+              <w:rPr>
+                <w:rFonts w:ascii="Calibri" w:hAnsi="Calibri" w:eastAsia="Calibri"/>
+                <w:b/>
+                <w:i w:val="0"/>
+                <w:color w:val="FFFFFF"/>
+                <w:sz w:val="18"/>
+              </w:rPr>
+              <w:t>Date</w:t>
+            </w:r>
+          </w:p>
+        </w:tc>
+        <w:tc>
+          <w:tcPr>
+            <w:tcW w:type="dxa" w:w="1738"/>
+            <w:shd w:fill="1F4D36" w:val="clear"/>
+          </w:tcPr>
+          <w:p>
+            <w:r/>
+            <w:r>
+              <w:rPr>
+                <w:rFonts w:ascii="Calibri" w:hAnsi="Calibri" w:eastAsia="Calibri"/>
+                <w:b/>
+                <w:i w:val="0"/>
+                <w:color w:val="FFFFFF"/>
+                <w:sz w:val="18"/>
+              </w:rPr>
+              <w:t>Site</w:t>
+            </w:r>
+          </w:p>
+        </w:tc>
+        <w:tc>
+          <w:tcPr>
+            <w:tcW w:type="dxa" w:w="1738"/>
+            <w:shd w:fill="1F4D36" w:val="clear"/>
+          </w:tcPr>
+          <w:p>
+            <w:r/>
+            <w:r>
+              <w:rPr>
+                <w:rFonts w:ascii="Calibri" w:hAnsi="Calibri" w:eastAsia="Calibri"/>
+                <w:b/>
+                <w:i w:val="0"/>
+                <w:color w:val="FFFFFF"/>
+                <w:sz w:val="18"/>
+              </w:rPr>
+              <w:t>Area swabbed</w:t>
+            </w:r>
+          </w:p>
+        </w:tc>
+        <w:tc>
+          <w:tcPr>
+            <w:tcW w:type="dxa" w:w="1738"/>
+            <w:shd w:fill="1F4D36" w:val="clear"/>
+          </w:tcPr>
+          <w:p>
+            <w:r/>
+            <w:r>
+              <w:rPr>
+                <w:rFonts w:ascii="Calibri" w:hAnsi="Calibri" w:eastAsia="Calibri"/>
+                <w:b/>
+                <w:i w:val="0"/>
+                <w:color w:val="FFFFFF"/>
+                <w:sz w:val="18"/>
+              </w:rPr>
+              <w:t>Lab result</w:t>
+            </w:r>
+          </w:p>
+        </w:tc>
+        <w:tc>
+          <w:tcPr>
+            <w:tcW w:type="dxa" w:w="1738"/>
+            <w:shd w:fill="1F4D36" w:val="clear"/>
+          </w:tcPr>
+          <w:p>
+            <w:r/>
+            <w:r>
+              <w:rPr>
+                <w:rFonts w:ascii="Calibri" w:hAnsi="Calibri" w:eastAsia="Calibri"/>
+                <w:b/>
+                <w:i w:val="0"/>
+                <w:color w:val="FFFFFF"/>
+                <w:sz w:val="18"/>
+              </w:rPr>
+              <w:t>Lot held</w:t>
+            </w:r>
+          </w:p>
+        </w:tc>
+        <w:tc>
+          <w:tcPr>
+            <w:tcW w:type="dxa" w:w="1738"/>
+            <w:shd w:fill="1F4D36" w:val="clear"/>
+          </w:tcPr>
+          <w:p>
+            <w:r/>
+            <w:r>
+              <w:rPr>
+                <w:rFonts w:ascii="Calibri" w:hAnsi="Calibri" w:eastAsia="Calibri"/>
+                <w:b/>
+                <w:i w:val="0"/>
+                <w:color w:val="FFFFFF"/>
+                <w:sz w:val="18"/>
+              </w:rPr>
+              <w:t>Initials</w:t>
+            </w:r>
+          </w:p>
+        </w:tc>
+      </w:tr>
+      <w:tr>
+        <w:trPr>
+          <w:cantSplit/>
+        </w:trPr>
+        <w:tc>
+          <w:tcPr>
+            <w:tcW w:type="dxa" w:w="1738"/>
+          </w:tcPr>
+          <w:p>
+            <w:r/>
+            <w:r>
+              <w:rPr>
+                <w:rFonts w:ascii="Calibri" w:hAnsi="Calibri" w:eastAsia="Calibri"/>
+                <w:b w:val="0"/>
+                <w:i w:val="0"/>
+                <w:color w:val="1E1A16"/>
+                <w:sz w:val="18"/>
+              </w:rPr>
+            </w:r>
+          </w:p>
+        </w:tc>
+        <w:tc>
+          <w:tcPr>
+            <w:tcW w:type="dxa" w:w="1738"/>
+          </w:tcPr>
+          <w:p>
+            <w:r/>
+            <w:r>
+              <w:rPr>
+                <w:rFonts w:ascii="Calibri" w:hAnsi="Calibri" w:eastAsia="Calibri"/>
+                <w:b w:val="0"/>
+                <w:i w:val="0"/>
+                <w:color w:val="1E1A16"/>
+                <w:sz w:val="18"/>
+              </w:rPr>
+              <w:t>Rack / tray</w:t>
+            </w:r>
+          </w:p>
+        </w:tc>
+        <w:tc>
+          <w:tcPr>
+            <w:tcW w:type="dxa" w:w="1738"/>
+          </w:tcPr>
+          <w:p>
+            <w:r/>
+            <w:r>
+              <w:rPr>
+                <w:rFonts w:ascii="Calibri" w:hAnsi="Calibri" w:eastAsia="Calibri"/>
+                <w:b w:val="0"/>
+                <w:i w:val="0"/>
+                <w:color w:val="1E1A16"/>
+                <w:sz w:val="18"/>
+              </w:rPr>
+            </w:r>
+          </w:p>
+        </w:tc>
+        <w:tc>
+          <w:tcPr>
+            <w:tcW w:type="dxa" w:w="1738"/>
+          </w:tcPr>
+          <w:p>
+            <w:r/>
+            <w:r>
+              <w:rPr>
+                <w:rFonts w:ascii="Calibri" w:hAnsi="Calibri" w:eastAsia="Calibri"/>
+                <w:b w:val="0"/>
+                <w:i w:val="0"/>
+                <w:color w:val="1E1A16"/>
+                <w:sz w:val="18"/>
+              </w:rPr>
+            </w:r>
+          </w:p>
+        </w:tc>
+        <w:tc>
+          <w:tcPr>
+            <w:tcW w:type="dxa" w:w="1738"/>
+          </w:tcPr>
+          <w:p>
+            <w:r/>
+            <w:r>
+              <w:rPr>
+                <w:rFonts w:ascii="Calibri" w:hAnsi="Calibri" w:eastAsia="Calibri"/>
+                <w:b w:val="0"/>
+                <w:i w:val="0"/>
+                <w:color w:val="1E1A16"/>
+                <w:sz w:val="18"/>
+              </w:rPr>
+              <w:t>yes / no</w:t>
+            </w:r>
+          </w:p>
+        </w:tc>
+        <w:tc>
+          <w:tcPr>
+            <w:tcW w:type="dxa" w:w="1738"/>
+          </w:tcPr>
+          <w:p>
+            <w:r/>
+            <w:r>
+              <w:rPr>
+                <w:rFonts w:ascii="Calibri" w:hAnsi="Calibri" w:eastAsia="Calibri"/>
+                <w:b w:val="0"/>
+                <w:i w:val="0"/>
+                <w:color w:val="1E1A16"/>
+                <w:sz w:val="18"/>
+              </w:rPr>
+            </w:r>
+          </w:p>
+        </w:tc>
+      </w:tr>
+      <w:tr>
+        <w:trPr>
+          <w:cantSplit/>
+        </w:trPr>
+        <w:tc>
+          <w:tcPr>
+            <w:tcW w:type="dxa" w:w="1738"/>
+            <w:shd w:fill="F4F1EA" w:val="clear"/>
+          </w:tcPr>
+          <w:p>
+            <w:r/>
+            <w:r>
+              <w:rPr>
+                <w:rFonts w:ascii="Calibri" w:hAnsi="Calibri" w:eastAsia="Calibri"/>
+                <w:b w:val="0"/>
+                <w:i w:val="0"/>
+                <w:color w:val="1E1A16"/>
+                <w:sz w:val="18"/>
+              </w:rPr>
+            </w:r>
+          </w:p>
+        </w:tc>
+        <w:tc>
+          <w:tcPr>
+            <w:tcW w:type="dxa" w:w="1738"/>
+            <w:shd w:fill="F4F1EA" w:val="clear"/>
+          </w:tcPr>
+          <w:p>
+            <w:r/>
+            <w:r>
+              <w:rPr>
+                <w:rFonts w:ascii="Calibri" w:hAnsi="Calibri" w:eastAsia="Calibri"/>
+                <w:b w:val="0"/>
+                <w:i w:val="0"/>
+                <w:color w:val="1E1A16"/>
+                <w:sz w:val="18"/>
+              </w:rPr>
+              <w:t>Table</w:t>
+            </w:r>
+          </w:p>
+        </w:tc>
+        <w:tc>
+          <w:tcPr>
+            <w:tcW w:type="dxa" w:w="1738"/>
+            <w:shd w:fill="F4F1EA" w:val="clear"/>
+          </w:tcPr>
+          <w:p>
+            <w:r/>
+            <w:r>
+              <w:rPr>
+                <w:rFonts w:ascii="Calibri" w:hAnsi="Calibri" w:eastAsia="Calibri"/>
+                <w:b w:val="0"/>
+                <w:i w:val="0"/>
+                <w:color w:val="1E1A16"/>
+                <w:sz w:val="18"/>
+              </w:rPr>
+            </w:r>
+          </w:p>
+        </w:tc>
+        <w:tc>
+          <w:tcPr>
+            <w:tcW w:type="dxa" w:w="1738"/>
+            <w:shd w:fill="F4F1EA" w:val="clear"/>
+          </w:tcPr>
+          <w:p>
+            <w:r/>
+            <w:r>
+              <w:rPr>
+                <w:rFonts w:ascii="Calibri" w:hAnsi="Calibri" w:eastAsia="Calibri"/>
+                <w:b w:val="0"/>
+                <w:i w:val="0"/>
+                <w:color w:val="1E1A16"/>
+                <w:sz w:val="18"/>
+              </w:rPr>
+            </w:r>
+          </w:p>
+        </w:tc>
+        <w:tc>
+          <w:tcPr>
+            <w:tcW w:type="dxa" w:w="1738"/>
+            <w:shd w:fill="F4F1EA" w:val="clear"/>
+          </w:tcPr>
+          <w:p>
+            <w:r/>
+            <w:r>
+              <w:rPr>
+                <w:rFonts w:ascii="Calibri" w:hAnsi="Calibri" w:eastAsia="Calibri"/>
+                <w:b w:val="0"/>
+                <w:i w:val="0"/>
+                <w:color w:val="1E1A16"/>
+                <w:sz w:val="18"/>
+              </w:rPr>
+              <w:t>yes / no</w:t>
+            </w:r>
+          </w:p>
+        </w:tc>
+        <w:tc>
+          <w:tcPr>
+            <w:tcW w:type="dxa" w:w="1738"/>
+            <w:shd w:fill="F4F1EA" w:val="clear"/>
+          </w:tcPr>
+          <w:p>
+            <w:r/>
+            <w:r>
+              <w:rPr>
+                <w:rFonts w:ascii="Calibri" w:hAnsi="Calibri" w:eastAsia="Calibri"/>
+                <w:b w:val="0"/>
+                <w:i w:val="0"/>
+                <w:color w:val="1E1A16"/>
+                <w:sz w:val="18"/>
+              </w:rPr>
+            </w:r>
+          </w:p>
+        </w:tc>
+      </w:tr>
+      <w:tr>
+        <w:trPr>
+          <w:cantSplit/>
+        </w:trPr>
+        <w:tc>
+          <w:tcPr>
+            <w:tcW w:type="dxa" w:w="1738"/>
+          </w:tcPr>
+          <w:p>
+            <w:r/>
+            <w:r>
+              <w:rPr>
+                <w:rFonts w:ascii="Calibri" w:hAnsi="Calibri" w:eastAsia="Calibri"/>
+                <w:b w:val="0"/>
+                <w:i w:val="0"/>
+                <w:color w:val="1E1A16"/>
+                <w:sz w:val="18"/>
+              </w:rPr>
+            </w:r>
+          </w:p>
+        </w:tc>
+        <w:tc>
+          <w:tcPr>
+            <w:tcW w:type="dxa" w:w="1738"/>
+          </w:tcPr>
+          <w:p>
+            <w:r/>
+            <w:r>
+              <w:rPr>
+                <w:rFonts w:ascii="Calibri" w:hAnsi="Calibri" w:eastAsia="Calibri"/>
+                <w:b w:val="0"/>
+                <w:i w:val="0"/>
+                <w:color w:val="1E1A16"/>
+                <w:sz w:val="18"/>
+              </w:rPr>
+              <w:t>Scale or tongs</w:t>
+            </w:r>
+          </w:p>
+        </w:tc>
+        <w:tc>
+          <w:tcPr>
+            <w:tcW w:type="dxa" w:w="1738"/>
+          </w:tcPr>
+          <w:p>
+            <w:r/>
+            <w:r>
+              <w:rPr>
+                <w:rFonts w:ascii="Calibri" w:hAnsi="Calibri" w:eastAsia="Calibri"/>
+                <w:b w:val="0"/>
+                <w:i w:val="0"/>
+                <w:color w:val="1E1A16"/>
+                <w:sz w:val="18"/>
+              </w:rPr>
+            </w:r>
+          </w:p>
+        </w:tc>
+        <w:tc>
+          <w:tcPr>
+            <w:tcW w:type="dxa" w:w="1738"/>
+          </w:tcPr>
+          <w:p>
+            <w:r/>
+            <w:r>
+              <w:rPr>
+                <w:rFonts w:ascii="Calibri" w:hAnsi="Calibri" w:eastAsia="Calibri"/>
+                <w:b w:val="0"/>
+                <w:i w:val="0"/>
+                <w:color w:val="1E1A16"/>
+                <w:sz w:val="18"/>
+              </w:rPr>
+            </w:r>
+          </w:p>
+        </w:tc>
+        <w:tc>
+          <w:tcPr>
+            <w:tcW w:type="dxa" w:w="1738"/>
+          </w:tcPr>
+          <w:p>
+            <w:r/>
+            <w:r>
+              <w:rPr>
+                <w:rFonts w:ascii="Calibri" w:hAnsi="Calibri" w:eastAsia="Calibri"/>
+                <w:b w:val="0"/>
+                <w:i w:val="0"/>
+                <w:color w:val="1E1A16"/>
+                <w:sz w:val="18"/>
+              </w:rPr>
+              <w:t>yes / no</w:t>
+            </w:r>
+          </w:p>
+        </w:tc>
+        <w:tc>
+          <w:tcPr>
+            <w:tcW w:type="dxa" w:w="1738"/>
+          </w:tcPr>
+          <w:p>
+            <w:r/>
+            <w:r>
+              <w:rPr>
+                <w:rFonts w:ascii="Calibri" w:hAnsi="Calibri" w:eastAsia="Calibri"/>
+                <w:b w:val="0"/>
+                <w:i w:val="0"/>
+                <w:color w:val="1E1A16"/>
+                <w:sz w:val="18"/>
+              </w:rPr>
+            </w:r>
+          </w:p>
+        </w:tc>
+      </w:tr>
+    </w:tbl>
+    <w:p>
+      <w:pPr>
+        <w:spacing w:after="80"/>
+      </w:pPr>
+    </w:p>
+    <w:p>
+      <w:pPr>
+        <w:spacing w:before="0" w:after="120" w:line="240" w:lineRule="auto"/>
+      </w:pPr>
+      <w:r>
+        <w:rPr>
+          <w:rFonts w:ascii="Calibri" w:hAnsi="Calibri" w:eastAsia="Calibri"/>
+          <w:b w:val="0"/>
+          <w:i w:val="0"/>
+          <w:color w:val="1E1A16"/>
+          <w:sz w:val="22"/>
+        </w:rPr>
+        <w:t>Form 10.6. Pre-operational check the same day: clean to sight and touch, yes / no __________. Person __________.</w:t>
+      </w:r>
+    </w:p>
+    <w:p>
+      <w:pPr>
+        <w:spacing w:before="280" w:after="120" w:line="240" w:lineRule="auto"/>
+      </w:pPr>
+      <w:r>
+        <w:rPr>
+          <w:rFonts w:ascii="Calibri" w:hAnsi="Calibri" w:eastAsia="Calibri"/>
+          <w:b/>
+          <w:i w:val="0"/>
+          <w:color w:val="1F4D36"/>
+          <w:sz w:val="32"/>
+        </w:rPr>
+        <w:t>16. Item 5 — instruments on site</w:t>
+      </w:r>
+    </w:p>
+    <w:p>
+      <w:pPr>
+        <w:spacing w:before="0" w:after="120" w:line="240" w:lineRule="auto"/>
+      </w:pPr>
+      <w:r>
+        <w:rPr>
+          <w:rFonts w:ascii="Calibri" w:hAnsi="Calibri" w:eastAsia="Calibri"/>
+          <w:b w:val="0"/>
+          <w:i w:val="0"/>
+          <w:color w:val="1E1A16"/>
+          <w:sz w:val="22"/>
+        </w:rPr>
+        <w:t>The first validation lot does not start until these three instruments are in the plant and the checks below are written. The oven dial is not one of the three.</w:t>
+      </w:r>
+    </w:p>
+    <w:tbl>
+      <w:tblPr>
+        <w:tblStyle w:val="TableGrid"/>
+        <w:tblW w:type="auto" w:w="0"/>
+        <w:tblLook w:firstColumn="1" w:firstRow="1" w:lastColumn="0" w:lastRow="0" w:noHBand="0" w:noVBand="1" w:val="04A0"/>
+      </w:tblPr>
+      <w:tblGrid>
+        <w:gridCol w:w="2606"/>
+        <w:gridCol w:w="2606"/>
+        <w:gridCol w:w="2606"/>
+        <w:gridCol w:w="2606"/>
+      </w:tblGrid>
+      <w:tr>
+        <w:trPr>
+          <w:cantSplit/>
+        </w:trPr>
+        <w:tc>
+          <w:tcPr>
+            <w:tcW w:type="dxa" w:w="2606"/>
+            <w:shd w:fill="1F4D36" w:val="clear"/>
+          </w:tcPr>
+          <w:p>
+            <w:r/>
+            <w:r>
+              <w:rPr>
+                <w:rFonts w:ascii="Calibri" w:hAnsi="Calibri" w:eastAsia="Calibri"/>
+                <w:b/>
+                <w:i w:val="0"/>
+                <w:color w:val="FFFFFF"/>
+                <w:sz w:val="16"/>
+              </w:rPr>
+              <w:t>Instrument</w:t>
+            </w:r>
+          </w:p>
+        </w:tc>
+        <w:tc>
+          <w:tcPr>
+            <w:tcW w:type="dxa" w:w="2606"/>
+            <w:shd w:fill="1F4D36" w:val="clear"/>
+          </w:tcPr>
+          <w:p>
+            <w:r/>
+            <w:r>
+              <w:rPr>
+                <w:rFonts w:ascii="Calibri" w:hAnsi="Calibri" w:eastAsia="Calibri"/>
+                <w:b/>
+                <w:i w:val="0"/>
+                <w:color w:val="FFFFFF"/>
+                <w:sz w:val="16"/>
+              </w:rPr>
+              <w:t>What it measures</w:t>
+            </w:r>
+          </w:p>
+        </w:tc>
+        <w:tc>
+          <w:tcPr>
+            <w:tcW w:type="dxa" w:w="2606"/>
+            <w:shd w:fill="1F4D36" w:val="clear"/>
+          </w:tcPr>
+          <w:p>
+            <w:r/>
+            <w:r>
+              <w:rPr>
+                <w:rFonts w:ascii="Calibri" w:hAnsi="Calibri" w:eastAsia="Calibri"/>
+                <w:b/>
+                <w:i w:val="0"/>
+                <w:color w:val="FFFFFF"/>
+                <w:sz w:val="16"/>
+              </w:rPr>
+              <w:t>Mark the ID</w:t>
+            </w:r>
+          </w:p>
+        </w:tc>
+        <w:tc>
+          <w:tcPr>
+            <w:tcW w:type="dxa" w:w="2606"/>
+            <w:shd w:fill="1F4D36" w:val="clear"/>
+          </w:tcPr>
+          <w:p>
+            <w:r/>
+            <w:r>
+              <w:rPr>
+                <w:rFonts w:ascii="Calibri" w:hAnsi="Calibri" w:eastAsia="Calibri"/>
+                <w:b/>
+                <w:i w:val="0"/>
+                <w:color w:val="FFFFFF"/>
+                <w:sz w:val="16"/>
+              </w:rPr>
+              <w:t>Check before use</w:t>
+            </w:r>
+          </w:p>
+        </w:tc>
+      </w:tr>
+      <w:tr>
+        <w:trPr>
+          <w:cantSplit/>
+        </w:trPr>
+        <w:tc>
+          <w:tcPr>
+            <w:tcW w:type="dxa" w:w="2606"/>
+          </w:tcPr>
+          <w:p>
+            <w:r/>
+            <w:r>
+              <w:rPr>
+                <w:rFonts w:ascii="Calibri" w:hAnsi="Calibri" w:eastAsia="Calibri"/>
+                <w:b w:val="0"/>
+                <w:i w:val="0"/>
+                <w:color w:val="1E1A16"/>
+                <w:sz w:val="16"/>
+              </w:rPr>
+              <w:t>Leave-in probe thermometer</w:t>
+            </w:r>
+          </w:p>
+        </w:tc>
+        <w:tc>
+          <w:tcPr>
+            <w:tcW w:type="dxa" w:w="2606"/>
+          </w:tcPr>
+          <w:p>
+            <w:r/>
+            <w:r>
+              <w:rPr>
+                <w:rFonts w:ascii="Calibri" w:hAnsi="Calibri" w:eastAsia="Calibri"/>
+                <w:b w:val="0"/>
+                <w:i w:val="0"/>
+                <w:color w:val="1E1A16"/>
+                <w:sz w:val="16"/>
+              </w:rPr>
+              <w:t>Internal meat temperature, °F. It stays in the strip inside the sealed bag.</w:t>
+            </w:r>
+          </w:p>
+        </w:tc>
+        <w:tc>
+          <w:tcPr>
+            <w:tcW w:type="dxa" w:w="2606"/>
+          </w:tcPr>
+          <w:p>
+            <w:r/>
+            <w:r>
+              <w:rPr>
+                <w:rFonts w:ascii="Calibri" w:hAnsi="Calibri" w:eastAsia="Calibri"/>
+                <w:b w:val="0"/>
+                <w:i w:val="0"/>
+                <w:color w:val="1E1A16"/>
+                <w:sz w:val="16"/>
+              </w:rPr>
+              <w:t>Probe __________</w:t>
+            </w:r>
+          </w:p>
+        </w:tc>
+        <w:tc>
+          <w:tcPr>
+            <w:tcW w:type="dxa" w:w="2606"/>
+          </w:tcPr>
+          <w:p>
+            <w:r/>
+            <w:r>
+              <w:rPr>
+                <w:rFonts w:ascii="Calibri" w:hAnsi="Calibri" w:eastAsia="Calibri"/>
+                <w:b w:val="0"/>
+                <w:i w:val="0"/>
+                <w:color w:val="1E1A16"/>
+                <w:sz w:val="16"/>
+              </w:rPr>
+              <w:t>Ice water reads 32°F. The probe does not touch the glass.</w:t>
+            </w:r>
+          </w:p>
+        </w:tc>
+      </w:tr>
+      <w:tr>
+        <w:trPr>
+          <w:cantSplit/>
+        </w:trPr>
+        <w:tc>
+          <w:tcPr>
+            <w:tcW w:type="dxa" w:w="2606"/>
+            <w:shd w:fill="F4F1EA" w:val="clear"/>
+          </w:tcPr>
+          <w:p>
+            <w:r/>
+            <w:r>
+              <w:rPr>
+                <w:rFonts w:ascii="Calibri" w:hAnsi="Calibri" w:eastAsia="Calibri"/>
+                <w:b w:val="0"/>
+                <w:i w:val="0"/>
+                <w:color w:val="1E1A16"/>
+                <w:sz w:val="16"/>
+              </w:rPr>
+              <w:t>Oven-air thermometer</w:t>
+            </w:r>
+          </w:p>
+        </w:tc>
+        <w:tc>
+          <w:tcPr>
+            <w:tcW w:type="dxa" w:w="2606"/>
+            <w:shd w:fill="F4F1EA" w:val="clear"/>
+          </w:tcPr>
+          <w:p>
+            <w:r/>
+            <w:r>
+              <w:rPr>
+                <w:rFonts w:ascii="Calibri" w:hAnsi="Calibri" w:eastAsia="Calibri"/>
+                <w:b w:val="0"/>
+                <w:i w:val="0"/>
+                <w:color w:val="1E1A16"/>
+                <w:sz w:val="16"/>
+              </w:rPr>
+              <w:t>Dry-bulb temperature during drying, °F. It hangs in the air, off the wall, not in the meat.</w:t>
+            </w:r>
+          </w:p>
+        </w:tc>
+        <w:tc>
+          <w:tcPr>
+            <w:tcW w:type="dxa" w:w="2606"/>
+            <w:shd w:fill="F4F1EA" w:val="clear"/>
+          </w:tcPr>
+          <w:p>
+            <w:r/>
+            <w:r>
+              <w:rPr>
+                <w:rFonts w:ascii="Calibri" w:hAnsi="Calibri" w:eastAsia="Calibri"/>
+                <w:b w:val="0"/>
+                <w:i w:val="0"/>
+                <w:color w:val="1E1A16"/>
+                <w:sz w:val="16"/>
+              </w:rPr>
+              <w:t>Oven __________</w:t>
+            </w:r>
+          </w:p>
+        </w:tc>
+        <w:tc>
+          <w:tcPr>
+            <w:tcW w:type="dxa" w:w="2606"/>
+            <w:shd w:fill="F4F1EA" w:val="clear"/>
+          </w:tcPr>
+          <w:p>
+            <w:r/>
+            <w:r>
+              <w:rPr>
+                <w:rFonts w:ascii="Calibri" w:hAnsi="Calibri" w:eastAsia="Calibri"/>
+                <w:b w:val="0"/>
+                <w:i w:val="0"/>
+                <w:color w:val="1E1A16"/>
+                <w:sz w:val="16"/>
+              </w:rPr>
+              <w:t>Ice water reads 32°F if the thermometer can be removed. If it is fixed, hold the calibrated probe in the oven air beside it and write both numbers. The probe is the record if they differ.</w:t>
+            </w:r>
+          </w:p>
+        </w:tc>
+      </w:tr>
+      <w:tr>
+        <w:trPr>
+          <w:cantSplit/>
+        </w:trPr>
+        <w:tc>
+          <w:tcPr>
+            <w:tcW w:type="dxa" w:w="2606"/>
+          </w:tcPr>
+          <w:p>
+            <w:r/>
+            <w:r>
+              <w:rPr>
+                <w:rFonts w:ascii="Calibri" w:hAnsi="Calibri" w:eastAsia="Calibri"/>
+                <w:b w:val="0"/>
+                <w:i w:val="0"/>
+                <w:color w:val="1E1A16"/>
+                <w:sz w:val="16"/>
+              </w:rPr>
+              <w:t>Water-activity meter</w:t>
+            </w:r>
+          </w:p>
+        </w:tc>
+        <w:tc>
+          <w:tcPr>
+            <w:tcW w:type="dxa" w:w="2606"/>
+          </w:tcPr>
+          <w:p>
+            <w:r/>
+            <w:r>
+              <w:rPr>
+                <w:rFonts w:ascii="Calibri" w:hAnsi="Calibri" w:eastAsia="Calibri"/>
+                <w:b w:val="0"/>
+                <w:i w:val="0"/>
+                <w:color w:val="1E1A16"/>
+                <w:sz w:val="16"/>
+              </w:rPr>
+              <w:t>Finished jerky, a number from 0 to 1. It is not a percent-moisture meter.</w:t>
+            </w:r>
+          </w:p>
+        </w:tc>
+        <w:tc>
+          <w:tcPr>
+            <w:tcW w:type="dxa" w:w="2606"/>
+          </w:tcPr>
+          <w:p>
+            <w:r/>
+            <w:r>
+              <w:rPr>
+                <w:rFonts w:ascii="Calibri" w:hAnsi="Calibri" w:eastAsia="Calibri"/>
+                <w:b w:val="0"/>
+                <w:i w:val="0"/>
+                <w:color w:val="1E1A16"/>
+                <w:sz w:val="16"/>
+              </w:rPr>
+              <w:t>Meter __________</w:t>
+            </w:r>
+          </w:p>
+        </w:tc>
+        <w:tc>
+          <w:tcPr>
+            <w:tcW w:type="dxa" w:w="2606"/>
+          </w:tcPr>
+          <w:p>
+            <w:r/>
+            <w:r>
+              <w:rPr>
+                <w:rFonts w:ascii="Calibri" w:hAnsi="Calibri" w:eastAsia="Calibri"/>
+                <w:b w:val="0"/>
+                <w:i w:val="0"/>
+                <w:color w:val="1E1A16"/>
+                <w:sz w:val="16"/>
+              </w:rPr>
+              <w:t>Salt standards supplied with the meter, in the week jerky is made.</w:t>
+            </w:r>
+          </w:p>
+        </w:tc>
+      </w:tr>
+    </w:tbl>
+    <w:p>
+      <w:pPr>
+        <w:spacing w:after="80"/>
+      </w:pPr>
+    </w:p>
+    <w:p>
+      <w:pPr>
+        <w:spacing w:before="0" w:after="120" w:line="240" w:lineRule="auto"/>
+      </w:pPr>
+      <w:r>
+        <w:rPr>
+          <w:rFonts w:ascii="Calibri" w:hAnsi="Calibri" w:eastAsia="Calibri"/>
+          <w:b w:val="0"/>
+          <w:i w:val="0"/>
+          <w:color w:val="1E1A16"/>
+          <w:sz w:val="22"/>
+        </w:rPr>
+        <w:t>An instrument that fails its check is not used. Lots measured with it since the last good check are reviewed. Form 10.7: date __________, probe 32°F yes / no, oven thermometer yes / no, water-activity standards yes / no, initials __________.</w:t>
       </w:r>
     </w:p>
     <w:sectPr>

</xml_diff>

<commit_message>
Add the plant logo and one example passing lot to the print packet.
The example is marked as not a production record. The signature line and the three validation lots stay blank.

Co-authored-by: quique2220-coder <quique2220-coder@users.noreply.github.com>
</commit_message>
<xml_diff>
--- a/haccp-plan/final/HACCP-Plan-Beef-Jerky-Final.docx
+++ b/haccp-plan/final/HACCP-Plan-Beef-Jerky-Final.docx
@@ -2,6 +2,46 @@
 <file path=word/document.xml><?xml version="1.0" encoding="utf-8"?>
 <w:document xmlns:wpc="http://schemas.microsoft.com/office/word/2010/wordprocessingCanvas" xmlns:mo="http://schemas.microsoft.com/office/mac/office/2008/main" xmlns:mc="http://schemas.openxmlformats.org/markup-compatibility/2006" xmlns:mv="urn:schemas-microsoft-com:mac:vml" xmlns:o="urn:schemas-microsoft-com:office:office" xmlns:r="http://schemas.openxmlformats.org/officeDocument/2006/relationships" xmlns:m="http://schemas.openxmlformats.org/officeDocument/2006/math" xmlns:v="urn:schemas-microsoft-com:vml" xmlns:wp14="http://schemas.microsoft.com/office/word/2010/wordprocessingDrawing" xmlns:wp="http://schemas.openxmlformats.org/drawingml/2006/wordprocessingDrawing" xmlns:w10="urn:schemas-microsoft-com:office:word" xmlns:w="http://schemas.openxmlformats.org/wordprocessingml/2006/main" xmlns:w14="http://schemas.microsoft.com/office/word/2010/wordml" xmlns:wpg="http://schemas.microsoft.com/office/word/2010/wordprocessingGroup" xmlns:wpi="http://schemas.microsoft.com/office/word/2010/wordprocessingInk" xmlns:wne="http://schemas.microsoft.com/office/word/2006/wordml" xmlns:wps="http://schemas.microsoft.com/office/word/2010/wordprocessingShape" mc:Ignorable="w14 wp14">
   <w:body>
+    <w:p>
+      <w:pPr>
+        <w:spacing w:after="80"/>
+        <w:jc w:val="center"/>
+      </w:pPr>
+      <w:r>
+        <w:drawing>
+          <wp:inline xmlns:a="http://schemas.openxmlformats.org/drawingml/2006/main" xmlns:pic="http://schemas.openxmlformats.org/drawingml/2006/picture">
+            <wp:extent cx="2286000" cy="1591475"/>
+            <wp:docPr id="1" name="Picture 1"/>
+            <wp:cNvGraphicFramePr>
+              <a:graphicFrameLocks noChangeAspect="1"/>
+            </wp:cNvGraphicFramePr>
+            <a:graphic>
+              <a:graphicData uri="http://schemas.openxmlformats.org/drawingml/2006/picture">
+                <pic:pic>
+                  <pic:nvPicPr>
+                    <pic:cNvPr id="0" name="logo-canales.png"/>
+                    <pic:cNvPicPr/>
+                  </pic:nvPicPr>
+                  <pic:blipFill>
+                    <a:blip r:embed="rId11"/>
+                    <a:stretch>
+                      <a:fillRect/>
+                    </a:stretch>
+                  </pic:blipFill>
+                  <pic:spPr>
+                    <a:xfrm>
+                      <a:off x="0" y="0"/>
+                      <a:ext cx="2286000" cy="1591475"/>
+                    </a:xfrm>
+                    <a:prstGeom prst="rect"/>
+                  </pic:spPr>
+                </pic:pic>
+              </a:graphicData>
+            </a:graphic>
+          </wp:inline>
+        </w:drawing>
+      </w:r>
+    </w:p>
     <w:p>
       <w:pPr>
         <w:spacing w:before="0" w:after="40" w:line="240" w:lineRule="auto"/>
@@ -225,7 +265,7 @@
         <w:drawing>
           <wp:inline xmlns:a="http://schemas.openxmlformats.org/drawingml/2006/main" xmlns:pic="http://schemas.openxmlformats.org/drawingml/2006/picture">
             <wp:extent cx="5943600" cy="8405949"/>
-            <wp:docPr id="1" name="Picture 1"/>
+            <wp:docPr id="2" name="Picture 2"/>
             <wp:cNvGraphicFramePr>
               <a:graphicFrameLocks noChangeAspect="1"/>
             </wp:cNvGraphicFramePr>
@@ -237,7 +277,7 @@
                     <pic:cNvPicPr/>
                   </pic:nvPicPr>
                   <pic:blipFill>
-                    <a:blip r:embed="rId11"/>
+                    <a:blip r:embed="rId12"/>
                     <a:stretch>
                       <a:fillRect/>
                     </a:stretch>
@@ -276,7 +316,7 @@
         <w:drawing>
           <wp:inline xmlns:a="http://schemas.openxmlformats.org/drawingml/2006/main" xmlns:pic="http://schemas.openxmlformats.org/drawingml/2006/picture">
             <wp:extent cx="5943600" cy="4086225"/>
-            <wp:docPr id="2" name="Picture 2"/>
+            <wp:docPr id="3" name="Picture 3"/>
             <wp:cNvGraphicFramePr>
               <a:graphicFrameLocks noChangeAspect="1"/>
             </wp:cNvGraphicFramePr>
@@ -288,7 +328,7 @@
                     <pic:cNvPicPr/>
                   </pic:nvPicPr>
                   <pic:blipFill>
-                    <a:blip r:embed="rId12"/>
+                    <a:blip r:embed="rId13"/>
                     <a:stretch>
                       <a:fillRect/>
                     </a:stretch>
@@ -7800,6 +7840,1041 @@
           <w:sz w:val="22"/>
         </w:rPr>
         <w:t>An instrument that fails its check is not used. Lots measured with it since the last good check are reviewed. Form 10.7: date __________, probe 32°F yes / no, oven thermometer yes / no, water-activity standards yes / no, initials __________.</w:t>
+      </w:r>
+    </w:p>
+    <w:p>
+      <w:pPr>
+        <w:spacing w:before="280" w:after="120" w:line="240" w:lineRule="auto"/>
+      </w:pPr>
+      <w:r>
+        <w:rPr>
+          <w:rFonts w:ascii="Calibri" w:hAnsi="Calibri" w:eastAsia="Calibri"/>
+          <w:b/>
+          <w:i w:val="0"/>
+          <w:color w:val="1F4D36"/>
+          <w:sz w:val="32"/>
+        </w:rPr>
+        <w:t>17. Example of a passing lot</w:t>
+      </w:r>
+    </w:p>
+    <w:p>
+      <w:pPr>
+        <w:spacing w:before="0" w:after="120" w:line="240" w:lineRule="auto"/>
+      </w:pPr>
+      <w:r>
+        <w:rPr>
+          <w:rFonts w:ascii="Calibri" w:hAnsi="Calibri" w:eastAsia="Calibri"/>
+          <w:b w:val="0"/>
+          <w:i w:val="0"/>
+          <w:color w:val="1E1A16"/>
+          <w:sz w:val="22"/>
+        </w:rPr>
+        <w:t>The field checklist asks whether monitoring records exist. This section shows how one passing lot is written. Every line below is an example. It is not a lot produced at this plant. It does not validate the plan and it is not a signature. The blank forms in Section 10 are the ones used in production. Section 8.1 is signed in ink only after a real review.</w:t>
+      </w:r>
+    </w:p>
+    <w:p>
+      <w:pPr>
+        <w:spacing w:before="0" w:after="120" w:line="240" w:lineRule="auto"/>
+      </w:pPr>
+      <w:r>
+        <w:rPr>
+          <w:rFonts w:ascii="Calibri" w:hAnsi="Calibri" w:eastAsia="Calibri"/>
+          <w:b w:val="0"/>
+          <w:i w:val="0"/>
+          <w:color w:val="1E1A16"/>
+          <w:sz w:val="22"/>
+        </w:rPr>
+        <w:t>Ejemplo nada más. Estos números no son un lote de la planta. No validan el plan y no sustituyen la firma.</w:t>
+      </w:r>
+    </w:p>
+    <w:p>
+      <w:pPr>
+        <w:spacing w:before="200" w:after="80" w:line="240" w:lineRule="auto"/>
+      </w:pPr>
+      <w:r>
+        <w:rPr>
+          <w:rFonts w:ascii="Calibri" w:hAnsi="Calibri" w:eastAsia="Calibri"/>
+          <w:b/>
+          <w:i w:val="0"/>
+          <w:color w:val="1F4D36"/>
+          <w:sz w:val="26"/>
+        </w:rPr>
+        <w:t>17.1 Example — CCP 1, lot EX-001</w:t>
+      </w:r>
+    </w:p>
+    <w:p>
+      <w:pPr>
+        <w:spacing w:before="0" w:after="120" w:line="240" w:lineRule="auto"/>
+      </w:pPr>
+      <w:r>
+        <w:rPr>
+          <w:rFonts w:ascii="Calibri" w:hAnsi="Calibri" w:eastAsia="Calibri"/>
+          <w:b w:val="0"/>
+          <w:i w:val="0"/>
+          <w:color w:val="1E1A16"/>
+          <w:sz w:val="22"/>
+        </w:rPr>
+        <w:t>Probe P-1. Cold spot: back, lower rack. Bag sealed on entry: yes. Thickest piece: yes.</w:t>
+      </w:r>
+    </w:p>
+    <w:tbl>
+      <w:tblPr>
+        <w:tblStyle w:val="TableGrid"/>
+        <w:tblW w:type="auto" w:w="0"/>
+        <w:tblLook w:firstColumn="1" w:firstRow="1" w:lastColumn="0" w:lastRow="0" w:noHBand="0" w:noVBand="1" w:val="04A0"/>
+      </w:tblPr>
+      <w:tblGrid>
+        <w:gridCol w:w="3475"/>
+        <w:gridCol w:w="3475"/>
+        <w:gridCol w:w="3475"/>
+      </w:tblGrid>
+      <w:tr>
+        <w:trPr>
+          <w:cantSplit/>
+        </w:trPr>
+        <w:tc>
+          <w:tcPr>
+            <w:tcW w:type="dxa" w:w="3475"/>
+            <w:shd w:fill="1F4D36" w:val="clear"/>
+          </w:tcPr>
+          <w:p>
+            <w:r/>
+            <w:r>
+              <w:rPr>
+                <w:rFonts w:ascii="Calibri" w:hAnsi="Calibri" w:eastAsia="Calibri"/>
+                <w:b/>
+                <w:i w:val="0"/>
+                <w:color w:val="FFFFFF"/>
+                <w:sz w:val="18"/>
+              </w:rPr>
+              <w:t>Reading</w:t>
+            </w:r>
+          </w:p>
+        </w:tc>
+        <w:tc>
+          <w:tcPr>
+            <w:tcW w:type="dxa" w:w="3475"/>
+            <w:shd w:fill="1F4D36" w:val="clear"/>
+          </w:tcPr>
+          <w:p>
+            <w:r/>
+            <w:r>
+              <w:rPr>
+                <w:rFonts w:ascii="Calibri" w:hAnsi="Calibri" w:eastAsia="Calibri"/>
+                <w:b/>
+                <w:i w:val="0"/>
+                <w:color w:val="FFFFFF"/>
+                <w:sz w:val="18"/>
+              </w:rPr>
+              <w:t>Clock time</w:t>
+            </w:r>
+          </w:p>
+        </w:tc>
+        <w:tc>
+          <w:tcPr>
+            <w:tcW w:type="dxa" w:w="3475"/>
+            <w:shd w:fill="1F4D36" w:val="clear"/>
+          </w:tcPr>
+          <w:p>
+            <w:r/>
+            <w:r>
+              <w:rPr>
+                <w:rFonts w:ascii="Calibri" w:hAnsi="Calibri" w:eastAsia="Calibri"/>
+                <w:b/>
+                <w:i w:val="0"/>
+                <w:color w:val="FFFFFF"/>
+                <w:sz w:val="18"/>
+              </w:rPr>
+              <w:t>Internal °F</w:t>
+            </w:r>
+          </w:p>
+        </w:tc>
+      </w:tr>
+      <w:tr>
+        <w:trPr>
+          <w:cantSplit/>
+        </w:trPr>
+        <w:tc>
+          <w:tcPr>
+            <w:tcW w:type="dxa" w:w="3475"/>
+          </w:tcPr>
+          <w:p>
+            <w:r/>
+            <w:r>
+              <w:rPr>
+                <w:rFonts w:ascii="Calibri" w:hAnsi="Calibri" w:eastAsia="Calibri"/>
+                <w:b w:val="0"/>
+                <w:i w:val="0"/>
+                <w:color w:val="1E1A16"/>
+                <w:sz w:val="18"/>
+              </w:rPr>
+              <w:t>Reaches 50°F</w:t>
+            </w:r>
+          </w:p>
+        </w:tc>
+        <w:tc>
+          <w:tcPr>
+            <w:tcW w:type="dxa" w:w="3475"/>
+          </w:tcPr>
+          <w:p>
+            <w:r/>
+            <w:r>
+              <w:rPr>
+                <w:rFonts w:ascii="Calibri" w:hAnsi="Calibri" w:eastAsia="Calibri"/>
+                <w:b w:val="0"/>
+                <w:i w:val="0"/>
+                <w:color w:val="1E1A16"/>
+                <w:sz w:val="18"/>
+              </w:rPr>
+              <w:t>8:00 a.m.</w:t>
+            </w:r>
+          </w:p>
+        </w:tc>
+        <w:tc>
+          <w:tcPr>
+            <w:tcW w:type="dxa" w:w="3475"/>
+          </w:tcPr>
+          <w:p>
+            <w:r/>
+            <w:r>
+              <w:rPr>
+                <w:rFonts w:ascii="Calibri" w:hAnsi="Calibri" w:eastAsia="Calibri"/>
+                <w:b w:val="0"/>
+                <w:i w:val="0"/>
+                <w:color w:val="1E1A16"/>
+                <w:sz w:val="18"/>
+              </w:rPr>
+              <w:t>50</w:t>
+            </w:r>
+          </w:p>
+        </w:tc>
+      </w:tr>
+      <w:tr>
+        <w:trPr>
+          <w:cantSplit/>
+        </w:trPr>
+        <w:tc>
+          <w:tcPr>
+            <w:tcW w:type="dxa" w:w="3475"/>
+            <w:shd w:fill="F4F1EA" w:val="clear"/>
+          </w:tcPr>
+          <w:p>
+            <w:r/>
+            <w:r>
+              <w:rPr>
+                <w:rFonts w:ascii="Calibri" w:hAnsi="Calibri" w:eastAsia="Calibri"/>
+                <w:b w:val="0"/>
+                <w:i w:val="0"/>
+                <w:color w:val="1E1A16"/>
+                <w:sz w:val="18"/>
+              </w:rPr>
+              <w:t>Reaches 130°F</w:t>
+            </w:r>
+          </w:p>
+        </w:tc>
+        <w:tc>
+          <w:tcPr>
+            <w:tcW w:type="dxa" w:w="3475"/>
+            <w:shd w:fill="F4F1EA" w:val="clear"/>
+          </w:tcPr>
+          <w:p>
+            <w:r/>
+            <w:r>
+              <w:rPr>
+                <w:rFonts w:ascii="Calibri" w:hAnsi="Calibri" w:eastAsia="Calibri"/>
+                <w:b w:val="0"/>
+                <w:i w:val="0"/>
+                <w:color w:val="1E1A16"/>
+                <w:sz w:val="18"/>
+              </w:rPr>
+              <w:t>10:15 a.m.</w:t>
+            </w:r>
+          </w:p>
+        </w:tc>
+        <w:tc>
+          <w:tcPr>
+            <w:tcW w:type="dxa" w:w="3475"/>
+            <w:shd w:fill="F4F1EA" w:val="clear"/>
+          </w:tcPr>
+          <w:p>
+            <w:r/>
+            <w:r>
+              <w:rPr>
+                <w:rFonts w:ascii="Calibri" w:hAnsi="Calibri" w:eastAsia="Calibri"/>
+                <w:b w:val="0"/>
+                <w:i w:val="0"/>
+                <w:color w:val="1E1A16"/>
+                <w:sz w:val="18"/>
+              </w:rPr>
+              <w:t>130</w:t>
+            </w:r>
+          </w:p>
+        </w:tc>
+      </w:tr>
+      <w:tr>
+        <w:trPr>
+          <w:cantSplit/>
+        </w:trPr>
+        <w:tc>
+          <w:tcPr>
+            <w:tcW w:type="dxa" w:w="3475"/>
+          </w:tcPr>
+          <w:p>
+            <w:r/>
+            <w:r>
+              <w:rPr>
+                <w:rFonts w:ascii="Calibri" w:hAnsi="Calibri" w:eastAsia="Calibri"/>
+                <w:b w:val="0"/>
+                <w:i w:val="0"/>
+                <w:color w:val="1E1A16"/>
+                <w:sz w:val="18"/>
+              </w:rPr>
+              <w:t>Come-up. Limit: 6 hours or less.</w:t>
+            </w:r>
+          </w:p>
+        </w:tc>
+        <w:tc>
+          <w:tcPr>
+            <w:tcW w:type="dxa" w:w="3475"/>
+          </w:tcPr>
+          <w:p>
+            <w:r/>
+            <w:r>
+              <w:rPr>
+                <w:rFonts w:ascii="Calibri" w:hAnsi="Calibri" w:eastAsia="Calibri"/>
+                <w:b w:val="0"/>
+                <w:i w:val="0"/>
+                <w:color w:val="1E1A16"/>
+                <w:sz w:val="18"/>
+              </w:rPr>
+              <w:t>2 hours 15 minutes</w:t>
+            </w:r>
+          </w:p>
+        </w:tc>
+        <w:tc>
+          <w:tcPr>
+            <w:tcW w:type="dxa" w:w="3475"/>
+          </w:tcPr>
+          <w:p>
+            <w:r/>
+            <w:r>
+              <w:rPr>
+                <w:rFonts w:ascii="Calibri" w:hAnsi="Calibri" w:eastAsia="Calibri"/>
+                <w:b w:val="0"/>
+                <w:i w:val="0"/>
+                <w:color w:val="1E1A16"/>
+                <w:sz w:val="18"/>
+              </w:rPr>
+              <w:t>Met</w:t>
+            </w:r>
+          </w:p>
+        </w:tc>
+      </w:tr>
+      <w:tr>
+        <w:trPr>
+          <w:cantSplit/>
+        </w:trPr>
+        <w:tc>
+          <w:tcPr>
+            <w:tcW w:type="dxa" w:w="3475"/>
+            <w:shd w:fill="F4F1EA" w:val="clear"/>
+          </w:tcPr>
+          <w:p>
+            <w:r/>
+            <w:r>
+              <w:rPr>
+                <w:rFonts w:ascii="Calibri" w:hAnsi="Calibri" w:eastAsia="Calibri"/>
+                <w:b w:val="0"/>
+                <w:i w:val="0"/>
+                <w:color w:val="1E1A16"/>
+                <w:sz w:val="18"/>
+              </w:rPr>
+              <w:t>Reaches 160°F or above</w:t>
+            </w:r>
+          </w:p>
+        </w:tc>
+        <w:tc>
+          <w:tcPr>
+            <w:tcW w:type="dxa" w:w="3475"/>
+            <w:shd w:fill="F4F1EA" w:val="clear"/>
+          </w:tcPr>
+          <w:p>
+            <w:r/>
+            <w:r>
+              <w:rPr>
+                <w:rFonts w:ascii="Calibri" w:hAnsi="Calibri" w:eastAsia="Calibri"/>
+                <w:b w:val="0"/>
+                <w:i w:val="0"/>
+                <w:color w:val="1E1A16"/>
+                <w:sz w:val="18"/>
+              </w:rPr>
+              <w:t>10:42 a.m.</w:t>
+            </w:r>
+          </w:p>
+        </w:tc>
+        <w:tc>
+          <w:tcPr>
+            <w:tcW w:type="dxa" w:w="3475"/>
+            <w:shd w:fill="F4F1EA" w:val="clear"/>
+          </w:tcPr>
+          <w:p>
+            <w:r/>
+            <w:r>
+              <w:rPr>
+                <w:rFonts w:ascii="Calibri" w:hAnsi="Calibri" w:eastAsia="Calibri"/>
+                <w:b w:val="0"/>
+                <w:i w:val="0"/>
+                <w:color w:val="1E1A16"/>
+                <w:sz w:val="18"/>
+              </w:rPr>
+              <w:t>162</w:t>
+            </w:r>
+          </w:p>
+        </w:tc>
+      </w:tr>
+      <w:tr>
+        <w:trPr>
+          <w:cantSplit/>
+        </w:trPr>
+        <w:tc>
+          <w:tcPr>
+            <w:tcW w:type="dxa" w:w="3475"/>
+          </w:tcPr>
+          <w:p>
+            <w:r/>
+            <w:r>
+              <w:rPr>
+                <w:rFonts w:ascii="Calibri" w:hAnsi="Calibri" w:eastAsia="Calibri"/>
+                <w:b w:val="0"/>
+                <w:i w:val="0"/>
+                <w:color w:val="1E1A16"/>
+                <w:sz w:val="18"/>
+              </w:rPr>
+              <w:t>Bag still sealed, then opened</w:t>
+            </w:r>
+          </w:p>
+        </w:tc>
+        <w:tc>
+          <w:tcPr>
+            <w:tcW w:type="dxa" w:w="3475"/>
+          </w:tcPr>
+          <w:p>
+            <w:r/>
+            <w:r>
+              <w:rPr>
+                <w:rFonts w:ascii="Calibri" w:hAnsi="Calibri" w:eastAsia="Calibri"/>
+                <w:b w:val="0"/>
+                <w:i w:val="0"/>
+                <w:color w:val="1E1A16"/>
+                <w:sz w:val="18"/>
+              </w:rPr>
+              <w:t>Opened 10:43 a.m.</w:t>
+            </w:r>
+          </w:p>
+        </w:tc>
+        <w:tc>
+          <w:tcPr>
+            <w:tcW w:type="dxa" w:w="3475"/>
+          </w:tcPr>
+          <w:p>
+            <w:r/>
+            <w:r>
+              <w:rPr>
+                <w:rFonts w:ascii="Calibri" w:hAnsi="Calibri" w:eastAsia="Calibri"/>
+                <w:b w:val="0"/>
+                <w:i w:val="0"/>
+                <w:color w:val="1E1A16"/>
+                <w:sz w:val="18"/>
+              </w:rPr>
+              <w:t>162</w:t>
+            </w:r>
+          </w:p>
+        </w:tc>
+      </w:tr>
+    </w:tbl>
+    <w:p>
+      <w:pPr>
+        <w:spacing w:after="80"/>
+      </w:pPr>
+    </w:p>
+    <w:p>
+      <w:pPr>
+        <w:spacing w:before="0" w:after="120" w:line="240" w:lineRule="auto"/>
+      </w:pPr>
+      <w:r>
+        <w:rPr>
+          <w:rFonts w:ascii="Calibri" w:hAnsi="Calibri" w:eastAsia="Calibri"/>
+          <w:b w:val="0"/>
+          <w:i w:val="0"/>
+          <w:color w:val="1E1A16"/>
+          <w:sz w:val="22"/>
+        </w:rPr>
+        <w:t>Example result: every CCP 1 limit met. This page is not signed as a real review.</w:t>
+      </w:r>
+    </w:p>
+    <w:p>
+      <w:pPr>
+        <w:spacing w:before="200" w:after="80" w:line="240" w:lineRule="auto"/>
+      </w:pPr>
+      <w:r>
+        <w:rPr>
+          <w:rFonts w:ascii="Calibri" w:hAnsi="Calibri" w:eastAsia="Calibri"/>
+          <w:b/>
+          <w:i w:val="0"/>
+          <w:color w:val="1F4D36"/>
+          <w:sz w:val="26"/>
+        </w:rPr>
+        <w:t>17.2 Example — CCP 2, lot EX-001</w:t>
+      </w:r>
+    </w:p>
+    <w:p>
+      <w:pPr>
+        <w:spacing w:before="0" w:after="120" w:line="240" w:lineRule="auto"/>
+      </w:pPr>
+      <w:r>
+        <w:rPr>
+          <w:rFonts w:ascii="Calibri" w:hAnsi="Calibri" w:eastAsia="Calibri"/>
+          <w:b w:val="0"/>
+          <w:i w:val="0"/>
+          <w:color w:val="1E1A16"/>
+          <w:sz w:val="22"/>
+        </w:rPr>
+        <w:t>CCP 1 passed before the bag was opened: yes. Dry bulb during drying: 176°F at 2:10 p.m. Limit: 170°F or above.</w:t>
+      </w:r>
+    </w:p>
+    <w:tbl>
+      <w:tblPr>
+        <w:tblStyle w:val="TableGrid"/>
+        <w:tblW w:type="auto" w:w="0"/>
+        <w:tblLook w:firstColumn="1" w:firstRow="1" w:lastColumn="0" w:lastRow="0" w:noHBand="0" w:noVBand="1" w:val="04A0"/>
+      </w:tblPr>
+      <w:tblGrid>
+        <w:gridCol w:w="3475"/>
+        <w:gridCol w:w="3475"/>
+        <w:gridCol w:w="3475"/>
+      </w:tblGrid>
+      <w:tr>
+        <w:trPr>
+          <w:cantSplit/>
+        </w:trPr>
+        <w:tc>
+          <w:tcPr>
+            <w:tcW w:type="dxa" w:w="3475"/>
+            <w:shd w:fill="1F4D36" w:val="clear"/>
+          </w:tcPr>
+          <w:p>
+            <w:r/>
+            <w:r>
+              <w:rPr>
+                <w:rFonts w:ascii="Calibri" w:hAnsi="Calibri" w:eastAsia="Calibri"/>
+                <w:b/>
+                <w:i w:val="0"/>
+                <w:color w:val="FFFFFF"/>
+                <w:sz w:val="18"/>
+              </w:rPr>
+              <w:t>Piece</w:t>
+            </w:r>
+          </w:p>
+        </w:tc>
+        <w:tc>
+          <w:tcPr>
+            <w:tcW w:type="dxa" w:w="3475"/>
+            <w:shd w:fill="1F4D36" w:val="clear"/>
+          </w:tcPr>
+          <w:p>
+            <w:r/>
+            <w:r>
+              <w:rPr>
+                <w:rFonts w:ascii="Calibri" w:hAnsi="Calibri" w:eastAsia="Calibri"/>
+                <w:b/>
+                <w:i w:val="0"/>
+                <w:color w:val="FFFFFF"/>
+                <w:sz w:val="18"/>
+              </w:rPr>
+              <w:t>Place in the lot</w:t>
+            </w:r>
+          </w:p>
+        </w:tc>
+        <w:tc>
+          <w:tcPr>
+            <w:tcW w:type="dxa" w:w="3475"/>
+            <w:shd w:fill="1F4D36" w:val="clear"/>
+          </w:tcPr>
+          <w:p>
+            <w:r/>
+            <w:r>
+              <w:rPr>
+                <w:rFonts w:ascii="Calibri" w:hAnsi="Calibri" w:eastAsia="Calibri"/>
+                <w:b/>
+                <w:i w:val="0"/>
+                <w:color w:val="FFFFFF"/>
+                <w:sz w:val="18"/>
+              </w:rPr>
+              <w:t>Water activity</w:t>
+            </w:r>
+          </w:p>
+        </w:tc>
+      </w:tr>
+      <w:tr>
+        <w:trPr>
+          <w:cantSplit/>
+        </w:trPr>
+        <w:tc>
+          <w:tcPr>
+            <w:tcW w:type="dxa" w:w="3475"/>
+          </w:tcPr>
+          <w:p>
+            <w:r/>
+            <w:r>
+              <w:rPr>
+                <w:rFonts w:ascii="Calibri" w:hAnsi="Calibri" w:eastAsia="Calibri"/>
+                <w:b w:val="0"/>
+                <w:i w:val="0"/>
+                <w:color w:val="1E1A16"/>
+                <w:sz w:val="18"/>
+              </w:rPr>
+              <w:t>1</w:t>
+            </w:r>
+          </w:p>
+        </w:tc>
+        <w:tc>
+          <w:tcPr>
+            <w:tcW w:type="dxa" w:w="3475"/>
+          </w:tcPr>
+          <w:p>
+            <w:r/>
+            <w:r>
+              <w:rPr>
+                <w:rFonts w:ascii="Calibri" w:hAnsi="Calibri" w:eastAsia="Calibri"/>
+                <w:b w:val="0"/>
+                <w:i w:val="0"/>
+                <w:color w:val="1E1A16"/>
+                <w:sz w:val="18"/>
+              </w:rPr>
+              <w:t>Front</w:t>
+            </w:r>
+          </w:p>
+        </w:tc>
+        <w:tc>
+          <w:tcPr>
+            <w:tcW w:type="dxa" w:w="3475"/>
+          </w:tcPr>
+          <w:p>
+            <w:r/>
+            <w:r>
+              <w:rPr>
+                <w:rFonts w:ascii="Calibri" w:hAnsi="Calibri" w:eastAsia="Calibri"/>
+                <w:b w:val="0"/>
+                <w:i w:val="0"/>
+                <w:color w:val="1E1A16"/>
+                <w:sz w:val="18"/>
+              </w:rPr>
+              <w:t>0.78</w:t>
+            </w:r>
+          </w:p>
+        </w:tc>
+      </w:tr>
+      <w:tr>
+        <w:trPr>
+          <w:cantSplit/>
+        </w:trPr>
+        <w:tc>
+          <w:tcPr>
+            <w:tcW w:type="dxa" w:w="3475"/>
+            <w:shd w:fill="F4F1EA" w:val="clear"/>
+          </w:tcPr>
+          <w:p>
+            <w:r/>
+            <w:r>
+              <w:rPr>
+                <w:rFonts w:ascii="Calibri" w:hAnsi="Calibri" w:eastAsia="Calibri"/>
+                <w:b w:val="0"/>
+                <w:i w:val="0"/>
+                <w:color w:val="1E1A16"/>
+                <w:sz w:val="18"/>
+              </w:rPr>
+              <w:t>2</w:t>
+            </w:r>
+          </w:p>
+        </w:tc>
+        <w:tc>
+          <w:tcPr>
+            <w:tcW w:type="dxa" w:w="3475"/>
+            <w:shd w:fill="F4F1EA" w:val="clear"/>
+          </w:tcPr>
+          <w:p>
+            <w:r/>
+            <w:r>
+              <w:rPr>
+                <w:rFonts w:ascii="Calibri" w:hAnsi="Calibri" w:eastAsia="Calibri"/>
+                <w:b w:val="0"/>
+                <w:i w:val="0"/>
+                <w:color w:val="1E1A16"/>
+                <w:sz w:val="18"/>
+              </w:rPr>
+              <w:t>Middle</w:t>
+            </w:r>
+          </w:p>
+        </w:tc>
+        <w:tc>
+          <w:tcPr>
+            <w:tcW w:type="dxa" w:w="3475"/>
+            <w:shd w:fill="F4F1EA" w:val="clear"/>
+          </w:tcPr>
+          <w:p>
+            <w:r/>
+            <w:r>
+              <w:rPr>
+                <w:rFonts w:ascii="Calibri" w:hAnsi="Calibri" w:eastAsia="Calibri"/>
+                <w:b w:val="0"/>
+                <w:i w:val="0"/>
+                <w:color w:val="1E1A16"/>
+                <w:sz w:val="18"/>
+              </w:rPr>
+              <w:t>0.80</w:t>
+            </w:r>
+          </w:p>
+        </w:tc>
+      </w:tr>
+      <w:tr>
+        <w:trPr>
+          <w:cantSplit/>
+        </w:trPr>
+        <w:tc>
+          <w:tcPr>
+            <w:tcW w:type="dxa" w:w="3475"/>
+          </w:tcPr>
+          <w:p>
+            <w:r/>
+            <w:r>
+              <w:rPr>
+                <w:rFonts w:ascii="Calibri" w:hAnsi="Calibri" w:eastAsia="Calibri"/>
+                <w:b w:val="0"/>
+                <w:i w:val="0"/>
+                <w:color w:val="1E1A16"/>
+                <w:sz w:val="18"/>
+              </w:rPr>
+              <w:t>3</w:t>
+            </w:r>
+          </w:p>
+        </w:tc>
+        <w:tc>
+          <w:tcPr>
+            <w:tcW w:type="dxa" w:w="3475"/>
+          </w:tcPr>
+          <w:p>
+            <w:r/>
+            <w:r>
+              <w:rPr>
+                <w:rFonts w:ascii="Calibri" w:hAnsi="Calibri" w:eastAsia="Calibri"/>
+                <w:b w:val="0"/>
+                <w:i w:val="0"/>
+                <w:color w:val="1E1A16"/>
+                <w:sz w:val="18"/>
+              </w:rPr>
+              <w:t>Back</w:t>
+            </w:r>
+          </w:p>
+        </w:tc>
+        <w:tc>
+          <w:tcPr>
+            <w:tcW w:type="dxa" w:w="3475"/>
+          </w:tcPr>
+          <w:p>
+            <w:r/>
+            <w:r>
+              <w:rPr>
+                <w:rFonts w:ascii="Calibri" w:hAnsi="Calibri" w:eastAsia="Calibri"/>
+                <w:b w:val="0"/>
+                <w:i w:val="0"/>
+                <w:color w:val="1E1A16"/>
+                <w:sz w:val="18"/>
+              </w:rPr>
+              <w:t>0.81</w:t>
+            </w:r>
+          </w:p>
+        </w:tc>
+      </w:tr>
+      <w:tr>
+        <w:trPr>
+          <w:cantSplit/>
+        </w:trPr>
+        <w:tc>
+          <w:tcPr>
+            <w:tcW w:type="dxa" w:w="3475"/>
+            <w:shd w:fill="F4F1EA" w:val="clear"/>
+          </w:tcPr>
+          <w:p>
+            <w:r/>
+            <w:r>
+              <w:rPr>
+                <w:rFonts w:ascii="Calibri" w:hAnsi="Calibri" w:eastAsia="Calibri"/>
+                <w:b w:val="0"/>
+                <w:i w:val="0"/>
+                <w:color w:val="1E1A16"/>
+                <w:sz w:val="18"/>
+              </w:rPr>
+              <w:t>4</w:t>
+            </w:r>
+          </w:p>
+        </w:tc>
+        <w:tc>
+          <w:tcPr>
+            <w:tcW w:type="dxa" w:w="3475"/>
+            <w:shd w:fill="F4F1EA" w:val="clear"/>
+          </w:tcPr>
+          <w:p>
+            <w:r/>
+            <w:r>
+              <w:rPr>
+                <w:rFonts w:ascii="Calibri" w:hAnsi="Calibri" w:eastAsia="Calibri"/>
+                <w:b w:val="0"/>
+                <w:i w:val="0"/>
+                <w:color w:val="1E1A16"/>
+                <w:sz w:val="18"/>
+              </w:rPr>
+              <w:t>Top rack</w:t>
+            </w:r>
+          </w:p>
+        </w:tc>
+        <w:tc>
+          <w:tcPr>
+            <w:tcW w:type="dxa" w:w="3475"/>
+            <w:shd w:fill="F4F1EA" w:val="clear"/>
+          </w:tcPr>
+          <w:p>
+            <w:r/>
+            <w:r>
+              <w:rPr>
+                <w:rFonts w:ascii="Calibri" w:hAnsi="Calibri" w:eastAsia="Calibri"/>
+                <w:b w:val="0"/>
+                <w:i w:val="0"/>
+                <w:color w:val="1E1A16"/>
+                <w:sz w:val="18"/>
+              </w:rPr>
+              <w:t>0.79</w:t>
+            </w:r>
+          </w:p>
+        </w:tc>
+      </w:tr>
+      <w:tr>
+        <w:trPr>
+          <w:cantSplit/>
+        </w:trPr>
+        <w:tc>
+          <w:tcPr>
+            <w:tcW w:type="dxa" w:w="3475"/>
+          </w:tcPr>
+          <w:p>
+            <w:r/>
+            <w:r>
+              <w:rPr>
+                <w:rFonts w:ascii="Calibri" w:hAnsi="Calibri" w:eastAsia="Calibri"/>
+                <w:b w:val="0"/>
+                <w:i w:val="0"/>
+                <w:color w:val="1E1A16"/>
+                <w:sz w:val="18"/>
+              </w:rPr>
+              <w:t>5</w:t>
+            </w:r>
+          </w:p>
+        </w:tc>
+        <w:tc>
+          <w:tcPr>
+            <w:tcW w:type="dxa" w:w="3475"/>
+          </w:tcPr>
+          <w:p>
+            <w:r/>
+            <w:r>
+              <w:rPr>
+                <w:rFonts w:ascii="Calibri" w:hAnsi="Calibri" w:eastAsia="Calibri"/>
+                <w:b w:val="0"/>
+                <w:i w:val="0"/>
+                <w:color w:val="1E1A16"/>
+                <w:sz w:val="18"/>
+              </w:rPr>
+              <w:t>Bottom rack</w:t>
+            </w:r>
+          </w:p>
+        </w:tc>
+        <w:tc>
+          <w:tcPr>
+            <w:tcW w:type="dxa" w:w="3475"/>
+          </w:tcPr>
+          <w:p>
+            <w:r/>
+            <w:r>
+              <w:rPr>
+                <w:rFonts w:ascii="Calibri" w:hAnsi="Calibri" w:eastAsia="Calibri"/>
+                <w:b w:val="0"/>
+                <w:i w:val="0"/>
+                <w:color w:val="1E1A16"/>
+                <w:sz w:val="18"/>
+              </w:rPr>
+              <w:t>0.82</w:t>
+            </w:r>
+          </w:p>
+        </w:tc>
+      </w:tr>
+      <w:tr>
+        <w:trPr>
+          <w:cantSplit/>
+        </w:trPr>
+        <w:tc>
+          <w:tcPr>
+            <w:tcW w:type="dxa" w:w="3475"/>
+            <w:shd w:fill="F4F1EA" w:val="clear"/>
+          </w:tcPr>
+          <w:p>
+            <w:r/>
+            <w:r>
+              <w:rPr>
+                <w:rFonts w:ascii="Calibri" w:hAnsi="Calibri" w:eastAsia="Calibri"/>
+                <w:b w:val="0"/>
+                <w:i w:val="0"/>
+                <w:color w:val="1E1A16"/>
+                <w:sz w:val="18"/>
+              </w:rPr>
+              <w:t>6</w:t>
+            </w:r>
+          </w:p>
+        </w:tc>
+        <w:tc>
+          <w:tcPr>
+            <w:tcW w:type="dxa" w:w="3475"/>
+            <w:shd w:fill="F4F1EA" w:val="clear"/>
+          </w:tcPr>
+          <w:p>
+            <w:r/>
+            <w:r>
+              <w:rPr>
+                <w:rFonts w:ascii="Calibri" w:hAnsi="Calibri" w:eastAsia="Calibri"/>
+                <w:b w:val="0"/>
+                <w:i w:val="0"/>
+                <w:color w:val="1E1A16"/>
+                <w:sz w:val="18"/>
+              </w:rPr>
+              <w:t>Thick piece</w:t>
+            </w:r>
+          </w:p>
+        </w:tc>
+        <w:tc>
+          <w:tcPr>
+            <w:tcW w:type="dxa" w:w="3475"/>
+            <w:shd w:fill="F4F1EA" w:val="clear"/>
+          </w:tcPr>
+          <w:p>
+            <w:r/>
+            <w:r>
+              <w:rPr>
+                <w:rFonts w:ascii="Calibri" w:hAnsi="Calibri" w:eastAsia="Calibri"/>
+                <w:b w:val="0"/>
+                <w:i w:val="0"/>
+                <w:color w:val="1E1A16"/>
+                <w:sz w:val="18"/>
+              </w:rPr>
+              <w:t>0.81</w:t>
+            </w:r>
+          </w:p>
+        </w:tc>
+      </w:tr>
+    </w:tbl>
+    <w:p>
+      <w:pPr>
+        <w:spacing w:after="80"/>
+      </w:pPr>
+    </w:p>
+    <w:p>
+      <w:pPr>
+        <w:spacing w:before="0" w:after="120" w:line="240" w:lineRule="auto"/>
+      </w:pPr>
+      <w:r>
+        <w:rPr>
+          <w:rFonts w:ascii="Calibri" w:hAnsi="Calibri" w:eastAsia="Calibri"/>
+          <w:b w:val="0"/>
+          <w:i w:val="0"/>
+          <w:color w:val="1E1A16"/>
+          <w:sz w:val="22"/>
+        </w:rPr>
+        <w:t>Highest reading: 0.82. Limit: 0.85 or less. Example result: met. Cooler example the same morning: 38°F in the meat, at or below 41°F.</w:t>
+      </w:r>
+    </w:p>
+    <w:p>
+      <w:pPr>
+        <w:spacing w:before="200" w:after="80" w:line="240" w:lineRule="auto"/>
+      </w:pPr>
+      <w:r>
+        <w:rPr>
+          <w:rFonts w:ascii="Calibri" w:hAnsi="Calibri" w:eastAsia="Calibri"/>
+          <w:b/>
+          <w:i w:val="0"/>
+          <w:color w:val="1F4D36"/>
+          <w:sz w:val="26"/>
+        </w:rPr>
+        <w:t>17.3 Example — pre-shipment review, lot EX-001</w:t>
+      </w:r>
+    </w:p>
+    <w:p>
+      <w:pPr>
+        <w:spacing w:after="40" w:before="0"/>
+        <w:ind w:left="360"/>
+      </w:pPr>
+      <w:r>
+        <w:rPr>
+          <w:rFonts w:ascii="Calibri" w:hAnsi="Calibri" w:eastAsia="Calibri"/>
+          <w:b w:val="0"/>
+          <w:i w:val="0"/>
+          <w:color w:val="1E1A16"/>
+          <w:sz w:val="22"/>
+        </w:rPr>
+        <w:t>• CCP 1 met: 162°F internal, come-up 2 hours 15 minutes, bag sealed until that reading.</w:t>
+      </w:r>
+    </w:p>
+    <w:p>
+      <w:pPr>
+        <w:spacing w:after="40" w:before="0"/>
+        <w:ind w:left="360"/>
+      </w:pPr>
+      <w:r>
+        <w:rPr>
+          <w:rFonts w:ascii="Calibri" w:hAnsi="Calibri" w:eastAsia="Calibri"/>
+          <w:b w:val="0"/>
+          <w:i w:val="0"/>
+          <w:color w:val="1E1A16"/>
+          <w:sz w:val="22"/>
+        </w:rPr>
+        <w:t>• CCP 2 met: dry bulb 176°F, highest water activity 0.82.</w:t>
+      </w:r>
+    </w:p>
+    <w:p>
+      <w:pPr>
+        <w:spacing w:after="40" w:before="0"/>
+        <w:ind w:left="360"/>
+      </w:pPr>
+      <w:r>
+        <w:rPr>
+          <w:rFonts w:ascii="Calibri" w:hAnsi="Calibri" w:eastAsia="Calibri"/>
+          <w:b w:val="0"/>
+          <w:i w:val="0"/>
+          <w:color w:val="1E1A16"/>
+          <w:sz w:val="22"/>
+        </w:rPr>
+        <w:t>• Bag says Contains: Soy, Wheat, and the ingredients match the batch sheet.</w:t>
+      </w:r>
+    </w:p>
+    <w:p>
+      <w:pPr>
+        <w:spacing w:before="0" w:after="120" w:line="240" w:lineRule="auto"/>
+      </w:pPr>
+      <w:r>
+        <w:rPr>
+          <w:rFonts w:ascii="Calibri" w:hAnsi="Calibri" w:eastAsia="Calibri"/>
+          <w:b w:val="0"/>
+          <w:i w:val="0"/>
+          <w:color w:val="1E1A16"/>
+          <w:sz w:val="22"/>
+        </w:rPr>
+        <w:t>A real pre-shipment review is signed on Form 10.5 for a real lot. Do not sign this example.</w:t>
       </w:r>
     </w:p>
     <w:sectPr>

</xml_diff>

<commit_message>
Map the shelf-stable preservation chapter onto this jerky.
State which hurdles apply, and record that fermentation, degree-hours, dry cure, and the sausage examples do not. Add the mold prerequisite the chapter requires when water activity is 0.85.

Co-authored-by: quique2220-coder <quique2220-coder@users.noreply.github.com>
</commit_message>
<xml_diff>
--- a/haccp-plan/final/HACCP-Plan-Beef-Jerky-Final.docx
+++ b/haccp-plan/final/HACCP-Plan-Beef-Jerky-Final.docx
@@ -2684,7 +2684,7 @@
                 <w:color w:val="1E1A16"/>
                 <w:sz w:val="16"/>
               </w:rPr>
-              <w:t>Biological: growth</w:t>
+              <w:t>Biological: pathogen growth; mold</w:t>
             </w:r>
           </w:p>
         </w:tc>
@@ -2720,7 +2720,7 @@
                 <w:color w:val="1E1A16"/>
                 <w:sz w:val="16"/>
               </w:rPr>
-              <w:t>Water activity is already 0.85 or less.</w:t>
+              <w:t>Pathogen growth is already prevented by CCP 2. Aspergillus flavus can still grow at a water activity of 0.80, so 0.85 does not stop mold. A bag with visible mold is held and does not ship.</w:t>
             </w:r>
           </w:p>
         </w:tc>
@@ -3158,6 +3158,21 @@
           <w:color w:val="1E1A16"/>
           <w:sz w:val="22"/>
         </w:rPr>
+        <w:t>The preservation chapter, page 166, states that drying, or a lower water activity, can increase heat resistance. The cook in this plan happens while the meat is still moist, inside the sealed bag. Dehydration starts only after the internal temperature is 160°F or above.</w:t>
+      </w:r>
+    </w:p>
+    <w:p>
+      <w:pPr>
+        <w:spacing w:before="0" w:after="120" w:line="240" w:lineRule="auto"/>
+      </w:pPr>
+      <w:r>
+        <w:rPr>
+          <w:rFonts w:ascii="Calibri" w:hAnsi="Calibri" w:eastAsia="Calibri"/>
+          <w:b w:val="0"/>
+          <w:i w:val="0"/>
+          <w:color w:val="1E1A16"/>
+          <w:sz w:val="22"/>
+        </w:rPr>
         <w:t>If any CCP 1 limit is missed: the lot is stopped and Jesús Canales is told. The lot is held. It is not opened for dehydration and it does not ship. The cause is written. The oven or the bag practice is corrected before the next lot. Product that missed the cook is not sold as ready-to-eat jerky. A laboratory test is not the release step.</w:t>
       </w:r>
     </w:p>
@@ -3533,6 +3548,22 @@
           <w:sz w:val="22"/>
         </w:rPr>
         <w:t>• Allergens. The batch sheet lists soy and wheat. The pack-out check confirms the bag says Contains: Soy, Wheat.</w:t>
+      </w:r>
+    </w:p>
+    <w:p>
+      <w:pPr>
+        <w:spacing w:after="40" w:before="0"/>
+        <w:ind w:left="360"/>
+      </w:pPr>
+      <w:r>
+        <w:rPr>
+          <w:rFonts w:ascii="Calibri" w:hAnsi="Calibri" w:eastAsia="Calibri"/>
+          <w:b w:val="0"/>
+          <w:i w:val="0"/>
+          <w:color w:val="1E1A16"/>
+          <w:sz w:val="22"/>
+        </w:rPr>
+        <w:t>• Closed bag and mold. The preservation chapter, pages 162–163, says mold can grow on dried meat that is not in an anaerobic package, and that mold can raise the pH. The growth table gives Aspergillus flavus a minimum water activity of 0.80, so 0.85 does not stop that mold. This formula has no anti-mold preservative, and this plan does not claim a vacuum pack or a modified atmosphere. The bag is heat-sealed the day CCP 2 passes, stored cool and dry, and kept closed until the buyer opens it. A bag with visible mold does not ship. Opened bags are not resold. A later change to vacuum, modified atmosphere, or an anti-mold ingredient is a reassessment.</w:t>
       </w:r>
     </w:p>
     <w:p>

</xml_diff>

<commit_message>
Keep the print packet in English only.
Remove the Spanish operating instructions and the Spanish example note so the inspector packet uses one language.

Co-authored-by: quique2220-coder <quique2220-coder@users.noreply.github.com>
</commit_message>
<xml_diff>
--- a/haccp-plan/final/HACCP-Plan-Beef-Jerky-Final.docx
+++ b/haccp-plan/final/HACCP-Plan-Beef-Jerky-Final.docx
@@ -4341,163 +4341,6 @@
           <w:color w:val="1F4D36"/>
           <w:sz w:val="32"/>
         </w:rPr>
-        <w:t>9-A. Cómo medir cada límite</w:t>
-      </w:r>
-    </w:p>
-    <w:p>
-      <w:pPr>
-        <w:spacing w:before="0" w:after="120" w:line="240" w:lineRule="auto"/>
-      </w:pPr>
-      <w:r>
-        <w:rPr>
-          <w:rFonts w:ascii="Calibri" w:hAnsi="Calibri" w:eastAsia="Calibri"/>
-          <w:b w:val="0"/>
-          <w:i w:val="0"/>
-          <w:color w:val="1E1A16"/>
-          <w:sz w:val="22"/>
-        </w:rPr>
-        <w:t>Esta sección es la misma instrucción, para la persona que opera el horno. Los límites siguen siendo los de la sección 6.</w:t>
-      </w:r>
-    </w:p>
-    <w:p>
-      <w:pPr>
-        <w:spacing w:before="0" w:after="120" w:line="240" w:lineRule="auto"/>
-      </w:pPr>
-      <w:r>
-        <w:rPr>
-          <w:rFonts w:ascii="Calibri" w:hAnsi="Calibri" w:eastAsia="Calibri"/>
-          <w:b w:val="0"/>
-          <w:i w:val="0"/>
-          <w:color w:val="1E1A16"/>
-          <w:sz w:val="22"/>
-        </w:rPr>
-        <w:t>Se usan tres instrumentos. Una sonda se queda dentro de la carne. Otro termómetro cuelga en el aire del horno durante el secado. Un medidor de actividad de agua lee el producto terminado. La perilla del horno es el ajuste. El número que se anota es el del instrumento.</w:t>
-      </w:r>
-    </w:p>
-    <w:p>
-      <w:pPr>
-        <w:spacing w:after="40" w:before="0"/>
-        <w:ind w:left="360"/>
-      </w:pPr>
-      <w:r>
-        <w:rPr>
-          <w:rFonts w:ascii="Calibri" w:hAnsi="Calibri" w:eastAsia="Calibri"/>
-          <w:b w:val="0"/>
-          <w:i w:val="0"/>
-          <w:color w:val="1E1A16"/>
-          <w:sz w:val="22"/>
-        </w:rPr>
-        <w:t>• Frío. La sonda va en la carne, no en el aire del refrigerador. Límite: 41°F o menos. Hoja 10.3.</w:t>
-      </w:r>
-    </w:p>
-    <w:p>
-      <w:pPr>
-        <w:spacing w:after="40" w:before="0"/>
-        <w:ind w:left="360"/>
-      </w:pPr>
-      <w:r>
-        <w:rPr>
-          <w:rFonts w:ascii="Calibri" w:hAnsi="Calibri" w:eastAsia="Calibri"/>
-          <w:b w:val="0"/>
-          <w:i w:val="0"/>
-          <w:color w:val="1E1A16"/>
-          <w:sz w:val="22"/>
-        </w:rPr>
-        <w:t>• Cocido. La tira más gruesa va en la parte del horno que se calienta menos. La punta de la sonda queda en el centro de esa tira, sin salir al aire y sin tocar la rejilla. La bolsa se cierra alrededor del cable. No se abre para ver la temperatura.</w:t>
-      </w:r>
-    </w:p>
-    <w:p>
-      <w:pPr>
-        <w:spacing w:after="40" w:before="0"/>
-        <w:ind w:left="360"/>
-      </w:pPr>
-      <w:r>
-        <w:rPr>
-          <w:rFonts w:ascii="Calibri" w:hAnsi="Calibri" w:eastAsia="Calibri"/>
-          <w:b w:val="0"/>
-          <w:i w:val="0"/>
-          <w:color w:val="1E1A16"/>
-          <w:sz w:val="22"/>
-        </w:rPr>
-        <w:t>• En la hoja 10.1 se anota la hora a 50°F, la hora a 130°F, y la hora y los grados al llegar a 160°F o más. El tiempo de subida es la hora de 130°F menos la hora de 50°F. Ejemplo: 8:00 y 10:30 son 2 horas 30 minutos. Límite: 6 horas o menos. Si a 160°F la bolsa sigue cerrada, el cocido pasó. Se anota la hora en que se abre. Si se abre antes, el lote se detiene.</w:t>
-      </w:r>
-    </w:p>
-    <w:p>
-      <w:pPr>
-        <w:spacing w:after="40" w:before="0"/>
-        <w:ind w:left="360"/>
-      </w:pPr>
-      <w:r>
-        <w:rPr>
-          <w:rFonts w:ascii="Calibri" w:hAnsi="Calibri" w:eastAsia="Calibri"/>
-          <w:b w:val="0"/>
-          <w:i w:val="0"/>
-          <w:color w:val="1E1A16"/>
-          <w:sz w:val="22"/>
-        </w:rPr>
-        <w:t>• Secado. Un termómetro cuelga en el aire del horno, lejos de la pared, sin clavarlo en la carne. Se lee antes de sacar las tiras. Límite: 170°F o más. Hoja 10.2.</w:t>
-      </w:r>
-    </w:p>
-    <w:p>
-      <w:pPr>
-        <w:spacing w:after="40" w:before="0"/>
-        <w:ind w:left="360"/>
-      </w:pPr>
-      <w:r>
-        <w:rPr>
-          <w:rFonts w:ascii="Calibri" w:hAnsi="Calibri" w:eastAsia="Calibri"/>
-          <w:b w:val="0"/>
-          <w:i w:val="0"/>
-          <w:color w:val="1E1A16"/>
-          <w:sz w:val="22"/>
-        </w:rPr>
-        <w:t>• Actividad de agua. El aparato marca un número entre 0 y 1, por ejemplo 0.81. No sirve un medidor que solo dé el porcentaje de humedad. Las piezas se enfrían tapadas hasta la temperatura del manual, casi siempre cerca de 77°F. Una tira a 170°F da una lectura falsa. Se toman seis tiras: adelante, en medio, atrás, rejilla de arriba, rejilla de abajo, y una gruesa. El resultado del lote es la lectura más alta. Si es 0.85 o menos, pasa. Si una marca más de 0.85, no se empaca.</w:t>
-      </w:r>
-    </w:p>
-    <w:p>
-      <w:pPr>
-        <w:spacing w:after="40" w:before="0"/>
-        <w:ind w:left="360"/>
-      </w:pPr>
-      <w:r>
-        <w:rPr>
-          <w:rFonts w:ascii="Calibri" w:hAnsi="Calibri" w:eastAsia="Calibri"/>
-          <w:b w:val="0"/>
-          <w:i w:val="0"/>
-          <w:color w:val="1E1A16"/>
-          <w:sz w:val="22"/>
-        </w:rPr>
-        <w:t>• Cada semana de producción: la sonda en hielo con un poco de agua, sin tocar el vaso, tiene que marcar 32°F. El medidor de actividad de agua se comprueba con las sales del fabricante. Si un aparato falla, no se usa, y se revisan los lotes medidos desde la última prueba buena.</w:t>
-      </w:r>
-    </w:p>
-    <w:p>
-      <w:pPr>
-        <w:spacing w:after="40" w:before="0"/>
-        <w:ind w:left="360"/>
-      </w:pPr>
-      <w:r>
-        <w:rPr>
-          <w:rFonts w:ascii="Calibri" w:hAnsi="Calibri" w:eastAsia="Calibri"/>
-          <w:b w:val="0"/>
-          <w:i w:val="0"/>
-          <w:color w:val="1E1A16"/>
-          <w:sz w:val="22"/>
-        </w:rPr>
-        <w:t>• El hisopo de Listeria es de mesas, charolas y superficies que tocan la carne después de abrir la bolsa. Va al laboratorio. No es un análisis de la bolsa. Humedad y proteína, para el nombre “jerky”, se mandan una vez en los lotes de validación. El lote lo sueltan la sonda, el reloj, el termómetro del aire y el medidor de actividad de agua.</w:t>
-      </w:r>
-    </w:p>
-    <w:p>
-      <w:pPr>
-        <w:spacing w:before="280" w:after="120" w:line="240" w:lineRule="auto"/>
-      </w:pPr>
-      <w:r>
-        <w:rPr>
-          <w:rFonts w:ascii="Calibri" w:hAnsi="Calibri" w:eastAsia="Calibri"/>
-          <w:b/>
-          <w:i w:val="0"/>
-          <w:color w:val="1F4D36"/>
-          <w:sz w:val="32"/>
-        </w:rPr>
         <w:t>10. Forms</w:t>
       </w:r>
     </w:p>
@@ -6810,21 +6653,6 @@
     </w:p>
     <w:p>
       <w:pPr>
-        <w:spacing w:before="0" w:after="120" w:line="240" w:lineRule="auto"/>
-      </w:pPr>
-      <w:r>
-        <w:rPr>
-          <w:rFonts w:ascii="Calibri" w:hAnsi="Calibri" w:eastAsia="Calibri"/>
-          <w:b w:val="0"/>
-          <w:i w:val="0"/>
-          <w:color w:val="1E1A16"/>
-          <w:sz w:val="22"/>
-        </w:rPr>
-        <w:t>Para quien opera el horno: la carne no se seca hasta que la bolsa cerrada llegó a 160°F por dentro. La sonda se queda en la tira más gruesa. La bolsa se abre después de anotar 160°F y de comprobar que de 50°F a 130°F pasaron 6 horas o menos. Luego se seca a 170°F en el aire del horno y se miden seis piezas. Si la más alta pasa de 0.85, no se empaca.</w:t>
-      </w:r>
-    </w:p>
-    <w:p>
-      <w:pPr>
         <w:spacing w:before="280" w:after="120" w:line="240" w:lineRule="auto"/>
       </w:pPr>
       <w:r>
@@ -7901,21 +7729,6 @@
           <w:sz w:val="22"/>
         </w:rPr>
         <w:t>The field checklist asks whether monitoring records exist. This section shows how one passing lot is written. Every line below is an example. It is not a lot produced at this plant. It does not validate the plan and it is not a signature. The blank forms in Section 10 are the ones used in production. Section 8.1 is signed in ink only after a real review.</w:t>
-      </w:r>
-    </w:p>
-    <w:p>
-      <w:pPr>
-        <w:spacing w:before="0" w:after="120" w:line="240" w:lineRule="auto"/>
-      </w:pPr>
-      <w:r>
-        <w:rPr>
-          <w:rFonts w:ascii="Calibri" w:hAnsi="Calibri" w:eastAsia="Calibri"/>
-          <w:b w:val="0"/>
-          <w:i w:val="0"/>
-          <w:color w:val="1E1A16"/>
-          <w:sz w:val="22"/>
-        </w:rPr>
-        <w:t>Ejemplo nada más. Estos números no son un lote de la planta. No validan el plan y no sustituyen la firma.</w:t>
       </w:r>
     </w:p>
     <w:p>

</xml_diff>